<commit_message>
docs(uebungsfall): Falldokumente als eigenständige Urkunden ohne Schulungs-Tell
Die drei Falldokumente sollen für sich allein als realistische Dokumente
dastehen, ohne sich selbst als konstruierter Übungsfall zu verraten.

- Untertitel "Fiktive ... zu Schulungszwecken" aus 01 (Vertrag),
  02 (Korrespondenz) und 04 (Baubeschreibung) entfernt; nur noch der
  reine Dokumenttitel bleibt. Fiktion ergibt sich weiterhin aus den
  offenkundig erfundenen Namen und .test-Mailadressen.
- 03 (Lösungsschlüssel) bleibt unverändert als klar gekennzeichneter
  Antwortschlüssel.
- PDF und DOCX für 01/02/04 mit pandoc + weasyprint neu gebaut;
  per pdftotext/pandoc verifiziert: Titel intakt, 0 Schulungs-Treffer.

Repo/README bleiben als Übungsfall gekennzeichnet — nur die einzelnen
Dokumentdateien stehen jetzt eigenständig da.

Co-Authored-By: Claude Opus 4.8 (1M context) <noreply@anthropic.com>
Claude-Session: https://claude.ai/code/session_01PPFkcnGNgQg3qLk2XGdib8
</commit_message>
<xml_diff>
--- a/uebungsfaelle/bautraegervertrag-neubauwohnung/gesamt-docx/01-bautraegervertrag.docx
+++ b/uebungsfaelle/bautraegervertrag-neubauwohnung/gesamt-docx/01-bautraegervertrag.docx
@@ -7,15 +7,43 @@
         <w:pStyle w:val="Title"/>
       </w:pPr>
       <w:r>
-        <w:t xml:space="preserve">Wohnungsbauträgervertrag mit Auflassung — UR-Nr. 188/2026 KQ</w:t>
-      </w:r>
-    </w:p>
-    <w:p>
-      <w:pPr>
-        <w:pStyle w:val="Subtitle"/>
-      </w:pPr>
-      <w:r>
-        <w:t xml:space="preserve">Fiktive notarielle Urkunde zu Schulungszwecken</w:t>
+        <w:t xml:space="preserve">Wohnungsbauträgervertrag</w:t>
+      </w:r>
+      <w:r>
+        <w:t xml:space="preserve"> </w:t>
+      </w:r>
+      <w:r>
+        <w:t xml:space="preserve">mit</w:t>
+      </w:r>
+      <w:r>
+        <w:t xml:space="preserve"> </w:t>
+      </w:r>
+      <w:r>
+        <w:t xml:space="preserve">Auflassung</w:t>
+      </w:r>
+      <w:r>
+        <w:t xml:space="preserve"> </w:t>
+      </w:r>
+      <w:r>
+        <w:t xml:space="preserve">—</w:t>
+      </w:r>
+      <w:r>
+        <w:t xml:space="preserve"> </w:t>
+      </w:r>
+      <w:r>
+        <w:t xml:space="preserve">UR-Nr.</w:t>
+      </w:r>
+      <w:r>
+        <w:t xml:space="preserve"> </w:t>
+      </w:r>
+      <w:r>
+        <w:t xml:space="preserve">188/2026</w:t>
+      </w:r>
+      <w:r>
+        <w:t xml:space="preserve"> </w:t>
+      </w:r>
+      <w:r>
+        <w:t xml:space="preserve">KQ</w:t>
       </w:r>
     </w:p>
     <w:p>
@@ -23,7 +51,7 @@
         <w:br w:type="page"/>
       </w:r>
     </w:p>
-    <w:bookmarkStart w:id="10" w:name="ur-nr.-1882026-kq"/>
+    <w:bookmarkStart w:id="21" w:name="ur-nr.-1882026-kq"/>
     <w:p>
       <w:pPr>
         <w:pStyle w:val="Heading1"/>
@@ -32,7 +60,7 @@
         <w:t xml:space="preserve">UR-Nr. 188/2026 KQ</w:t>
       </w:r>
     </w:p>
-    <w:bookmarkStart w:id="9" w:name="verhandelt"/>
+    <w:bookmarkStart w:id="20" w:name="verhandelt"/>
     <w:p>
       <w:pPr>
         <w:pStyle w:val="Heading2"/>
@@ -63,8 +91,8 @@
       </w:pPr>
       <w:r>
         <w:rPr>
-          <w:b/>
-          <w:bCs/>
+          <w:bCs/>
+          <w:b/>
         </w:rPr>
         <w:t xml:space="preserve">Dr. Adalbert von Sickingen-Querfurt</w:t>
       </w:r>
@@ -97,8 +125,8 @@
       </w:r>
       <w:r>
         <w:rPr>
-          <w:b/>
-          <w:bCs/>
+          <w:bCs/>
+          <w:b/>
         </w:rPr>
         <w:t xml:space="preserve">Roswitha Quendel-Bingenheimer</w:t>
       </w:r>
@@ -136,8 +164,8 @@
       </w:pPr>
       <w:r>
         <w:rPr>
-          <w:b/>
-          <w:bCs/>
+          <w:bCs/>
+          <w:b/>
         </w:rPr>
         <w:t xml:space="preserve">Hohenwartshofen Quartiersentwicklung GmbH &amp; Co. KG</w:t>
       </w:r>
@@ -186,8 +214,8 @@
       </w:r>
       <w:r>
         <w:rPr>
-          <w:b/>
-          <w:bCs/>
+          <w:bCs/>
+          <w:b/>
         </w:rPr>
         <w:t xml:space="preserve">Dr. Eberwein Übelacker-Strohmeyer</w:t>
       </w:r>
@@ -251,9 +279,9 @@
         <w:t xml:space="preserve">Die Erschienenen baten sodann um die Beurkundung des nachstehenden</w:t>
       </w:r>
     </w:p>
-    <w:bookmarkEnd w:id="9"/>
-    <w:bookmarkEnd w:id="10"/>
-    <w:bookmarkStart w:id="12" w:name="wohnungsbauträgervertrags-mit-auflassung"/>
+    <w:bookmarkEnd w:id="20"/>
+    <w:bookmarkEnd w:id="21"/>
+    <w:bookmarkStart w:id="23" w:name="wohnungsbauträgervertrags-mit-auflassung"/>
     <w:p>
       <w:pPr>
         <w:pStyle w:val="Heading1"/>
@@ -262,7 +290,7 @@
         <w:t xml:space="preserve">Wohnungsbauträgervertrags mit Auflassung</w:t>
       </w:r>
     </w:p>
-    <w:bookmarkStart w:id="11" w:name="vorbemerkungen"/>
+    <w:bookmarkStart w:id="22" w:name="vorbemerkungen"/>
     <w:p>
       <w:pPr>
         <w:pStyle w:val="Heading2"/>
@@ -277,8 +305,8 @@
       </w:pPr>
       <w:r>
         <w:rPr>
-          <w:b/>
-          <w:bCs/>
+          <w:bCs/>
+          <w:b/>
         </w:rPr>
         <w:t xml:space="preserve">0.1</w:t>
       </w:r>
@@ -327,8 +355,8 @@
       </w:pPr>
       <w:r>
         <w:rPr>
-          <w:b/>
-          <w:bCs/>
+          <w:bCs/>
+          <w:b/>
         </w:rPr>
         <w:t xml:space="preserve">0.2</w:t>
       </w:r>
@@ -369,8 +397,8 @@
       </w:pPr>
       <w:r>
         <w:rPr>
-          <w:b/>
-          <w:bCs/>
+          <w:bCs/>
+          <w:b/>
         </w:rPr>
         <w:t xml:space="preserve">0.3</w:t>
       </w:r>
@@ -387,8 +415,8 @@
       </w:pPr>
       <w:r>
         <w:rPr>
-          <w:b/>
-          <w:bCs/>
+          <w:bCs/>
+          <w:b/>
         </w:rPr>
         <w:t xml:space="preserve">0.4</w:t>
       </w:r>
@@ -405,8 +433,8 @@
       </w:pPr>
       <w:r>
         <w:rPr>
-          <w:b/>
-          <w:bCs/>
+          <w:bCs/>
+          <w:b/>
         </w:rPr>
         <w:t xml:space="preserve">0.5</w:t>
       </w:r>
@@ -423,8 +451,8 @@
       </w:pPr>
       <w:r>
         <w:rPr>
-          <w:b/>
-          <w:bCs/>
+          <w:bCs/>
+          <w:b/>
         </w:rPr>
         <w:t xml:space="preserve">0.6</w:t>
       </w:r>
@@ -441,8 +469,8 @@
       </w:pPr>
       <w:r>
         <w:rPr>
-          <w:b/>
-          <w:bCs/>
+          <w:bCs/>
+          <w:b/>
         </w:rPr>
         <w:t xml:space="preserve">0.7</w:t>
       </w:r>
@@ -458,9 +486,9 @@
         <w:br w:type="page"/>
       </w:r>
     </w:p>
-    <w:bookmarkEnd w:id="11"/>
-    <w:bookmarkEnd w:id="12"/>
-    <w:bookmarkStart w:id="13" w:name="kaufgegenstand"/>
+    <w:bookmarkEnd w:id="22"/>
+    <w:bookmarkEnd w:id="23"/>
+    <w:bookmarkStart w:id="24" w:name="kaufgegenstand"/>
     <w:p>
       <w:pPr>
         <w:pStyle w:val="Heading1"/>
@@ -475,8 +503,8 @@
       </w:pPr>
       <w:r>
         <w:rPr>
-          <w:b/>
-          <w:bCs/>
+          <w:bCs/>
+          <w:b/>
         </w:rPr>
         <w:t xml:space="preserve">1.1</w:t>
       </w:r>
@@ -501,8 +529,8 @@
       </w:pPr>
       <w:r>
         <w:rPr>
-          <w:b/>
-          <w:bCs/>
+          <w:bCs/>
+          <w:b/>
         </w:rPr>
         <w:t xml:space="preserve">1.2</w:t>
       </w:r>
@@ -519,8 +547,8 @@
       </w:pPr>
       <w:r>
         <w:rPr>
-          <w:b/>
-          <w:bCs/>
+          <w:bCs/>
+          <w:b/>
         </w:rPr>
         <w:t xml:space="preserve">1.3</w:t>
       </w:r>
@@ -552,8 +580,8 @@
         <w:br w:type="page"/>
       </w:r>
     </w:p>
-    <w:bookmarkEnd w:id="13"/>
-    <w:bookmarkStart w:id="14" w:name="kaufpreis"/>
+    <w:bookmarkEnd w:id="24"/>
+    <w:bookmarkStart w:id="25" w:name="kaufpreis"/>
     <w:p>
       <w:pPr>
         <w:pStyle w:val="Heading1"/>
@@ -568,8 +596,8 @@
       </w:pPr>
       <w:r>
         <w:rPr>
-          <w:b/>
-          <w:bCs/>
+          <w:bCs/>
+          <w:b/>
         </w:rPr>
         <w:t xml:space="preserve">2.1</w:t>
       </w:r>
@@ -586,8 +614,8 @@
       </w:pPr>
       <w:r>
         <w:rPr>
-          <w:b/>
-          <w:bCs/>
+          <w:bCs/>
+          <w:b/>
         </w:rPr>
         <w:t xml:space="preserve">789.500,00 EUR</w:t>
       </w:r>
@@ -606,8 +634,8 @@
       </w:pPr>
       <w:r>
         <w:rPr>
-          <w:b/>
-          <w:bCs/>
+          <w:bCs/>
+          <w:b/>
         </w:rPr>
         <w:t xml:space="preserve">2.2</w:t>
       </w:r>
@@ -624,8 +652,8 @@
       </w:pPr>
       <w:r>
         <w:rPr>
-          <w:b/>
-          <w:bCs/>
+          <w:bCs/>
+          <w:b/>
         </w:rPr>
         <w:t xml:space="preserve">2.3</w:t>
       </w:r>
@@ -641,8 +669,8 @@
         <w:br w:type="page"/>
       </w:r>
     </w:p>
-    <w:bookmarkEnd w:id="14"/>
-    <w:bookmarkStart w:id="15" w:name="kaufpreiszahlung-fälligkeit"/>
+    <w:bookmarkEnd w:id="25"/>
+    <w:bookmarkStart w:id="26" w:name="kaufpreiszahlung-fälligkeit"/>
     <w:p>
       <w:pPr>
         <w:pStyle w:val="Heading1"/>
@@ -657,8 +685,8 @@
       </w:pPr>
       <w:r>
         <w:rPr>
-          <w:b/>
-          <w:bCs/>
+          <w:bCs/>
+          <w:b/>
         </w:rPr>
         <w:t xml:space="preserve">3.1</w:t>
       </w:r>
@@ -724,8 +752,8 @@
       </w:pPr>
       <w:r>
         <w:rPr>
-          <w:b/>
-          <w:bCs/>
+          <w:bCs/>
+          <w:b/>
         </w:rPr>
         <w:t xml:space="preserve">3.2</w:t>
       </w:r>
@@ -740,8 +768,8 @@
       <w:tblPr>
         <w:tblStyle w:val="Table"/>
         <w:tblW w:type="pct" w:w="5000"/>
-        <w:tblLayout w:type="fixed"/>
         <w:tblLook w:firstRow="1" w:lastRow="0" w:firstColumn="0" w:lastColumn="0" w:noHBand="0" w:noVBand="0" w:val="0020"/>
+        <w:jc w:val="start"/>
       </w:tblPr>
       <w:tblGrid>
         <w:gridCol w:w="2640"/>
@@ -750,13 +778,14 @@
       </w:tblGrid>
       <w:tr>
         <w:trPr>
-          <w:tblHeader w:val="on"/>
+          <w:tblHeader w:val="true"/>
         </w:trPr>
         <w:tc>
           <w:tcPr/>
           <w:p>
             <w:pPr>
               <w:pStyle w:val="Compact"/>
+              <w:jc w:val="left"/>
             </w:pPr>
             <w:r>
               <w:t xml:space="preserve">Rate</w:t>
@@ -768,6 +797,7 @@
           <w:p>
             <w:pPr>
               <w:pStyle w:val="Compact"/>
+              <w:jc w:val="left"/>
             </w:pPr>
             <w:r>
               <w:t xml:space="preserve">Stichmonat</w:t>
@@ -779,6 +809,7 @@
           <w:p>
             <w:pPr>
               <w:pStyle w:val="Compact"/>
+              <w:jc w:val="left"/>
             </w:pPr>
             <w:r>
               <w:t xml:space="preserve">Anteil</w:t>
@@ -792,6 +823,7 @@
           <w:p>
             <w:pPr>
               <w:pStyle w:val="Compact"/>
+              <w:jc w:val="left"/>
             </w:pPr>
             <w:r>
               <w:t xml:space="preserve">1. Rate</w:t>
@@ -803,6 +835,7 @@
           <w:p>
             <w:pPr>
               <w:pStyle w:val="Compact"/>
+              <w:jc w:val="left"/>
             </w:pPr>
             <w:r>
               <w:t xml:space="preserve">nach Beginn der Erdarbeiten</w:t>
@@ -814,6 +847,7 @@
           <w:p>
             <w:pPr>
               <w:pStyle w:val="Compact"/>
+              <w:jc w:val="left"/>
             </w:pPr>
             <w:r>
               <w:t xml:space="preserve">30,0 %</w:t>
@@ -827,6 +861,7 @@
           <w:p>
             <w:pPr>
               <w:pStyle w:val="Compact"/>
+              <w:jc w:val="left"/>
             </w:pPr>
             <w:r>
               <w:t xml:space="preserve">2. Rate</w:t>
@@ -838,6 +873,7 @@
           <w:p>
             <w:pPr>
               <w:pStyle w:val="Compact"/>
+              <w:jc w:val="left"/>
             </w:pPr>
             <w:r>
               <w:t xml:space="preserve">nach Rohbaufertigstellung einschließlich Zimmererarbeiten</w:t>
@@ -849,6 +885,7 @@
           <w:p>
             <w:pPr>
               <w:pStyle w:val="Compact"/>
+              <w:jc w:val="left"/>
             </w:pPr>
             <w:r>
               <w:t xml:space="preserve">28,0 %</w:t>
@@ -862,6 +899,7 @@
           <w:p>
             <w:pPr>
               <w:pStyle w:val="Compact"/>
+              <w:jc w:val="left"/>
             </w:pPr>
             <w:r>
               <w:t xml:space="preserve">3. Rate</w:t>
@@ -873,6 +911,7 @@
           <w:p>
             <w:pPr>
               <w:pStyle w:val="Compact"/>
+              <w:jc w:val="left"/>
             </w:pPr>
             <w:r>
               <w:t xml:space="preserve">nach Herstellung der Dachflächen und Dachrinnen, Ausführung der Rohinstallation der Heizungs-, Sanitär- und Elektroanlagen sowie Fenstereinbau einschließlich Verglasung</w:t>
@@ -884,6 +923,7 @@
           <w:p>
             <w:pPr>
               <w:pStyle w:val="Compact"/>
+              <w:jc w:val="left"/>
             </w:pPr>
             <w:r>
               <w:t xml:space="preserve">18,9 %</w:t>
@@ -897,6 +937,7 @@
           <w:p>
             <w:pPr>
               <w:pStyle w:val="Compact"/>
+              <w:jc w:val="left"/>
             </w:pPr>
             <w:r>
               <w:t xml:space="preserve">4. Rate</w:t>
@@ -908,6 +949,7 @@
           <w:p>
             <w:pPr>
               <w:pStyle w:val="Compact"/>
+              <w:jc w:val="left"/>
             </w:pPr>
             <w:r>
               <w:t xml:space="preserve">nach Innenputz, Estrich und Fliesenarbeiten im Sanitärbereich</w:t>
@@ -919,6 +961,7 @@
           <w:p>
             <w:pPr>
               <w:pStyle w:val="Compact"/>
+              <w:jc w:val="left"/>
             </w:pPr>
             <w:r>
               <w:t xml:space="preserve">9,1 %</w:t>
@@ -932,6 +975,7 @@
           <w:p>
             <w:pPr>
               <w:pStyle w:val="Compact"/>
+              <w:jc w:val="left"/>
             </w:pPr>
             <w:r>
               <w:t xml:space="preserve">5. Rate</w:t>
@@ -943,6 +987,7 @@
           <w:p>
             <w:pPr>
               <w:pStyle w:val="Compact"/>
+              <w:jc w:val="left"/>
             </w:pPr>
             <w:r>
               <w:t xml:space="preserve">nach Bezugsfertigkeit Zug um Zug gegen Besitzübergabe</w:t>
@@ -954,6 +999,7 @@
           <w:p>
             <w:pPr>
               <w:pStyle w:val="Compact"/>
+              <w:jc w:val="left"/>
             </w:pPr>
             <w:r>
               <w:t xml:space="preserve">8,4 %</w:t>
@@ -967,6 +1013,7 @@
           <w:p>
             <w:pPr>
               <w:pStyle w:val="Compact"/>
+              <w:jc w:val="left"/>
             </w:pPr>
             <w:r>
               <w:t xml:space="preserve">6. Rate</w:t>
@@ -978,6 +1025,7 @@
           <w:p>
             <w:pPr>
               <w:pStyle w:val="Compact"/>
+              <w:jc w:val="left"/>
             </w:pPr>
             <w:r>
               <w:t xml:space="preserve">nach Fassadenarbeiten</w:t>
@@ -989,6 +1037,7 @@
           <w:p>
             <w:pPr>
               <w:pStyle w:val="Compact"/>
+              <w:jc w:val="left"/>
             </w:pPr>
             <w:r>
               <w:t xml:space="preserve">2,1 %</w:t>
@@ -1002,6 +1051,7 @@
           <w:p>
             <w:pPr>
               <w:pStyle w:val="Compact"/>
+              <w:jc w:val="left"/>
             </w:pPr>
             <w:r>
               <w:t xml:space="preserve">7. Rate</w:t>
@@ -1013,6 +1063,7 @@
           <w:p>
             <w:pPr>
               <w:pStyle w:val="Compact"/>
+              <w:jc w:val="left"/>
             </w:pPr>
             <w:r>
               <w:t xml:space="preserve">nach vollständiger Fertigstellung</w:t>
@@ -1024,6 +1075,7 @@
           <w:p>
             <w:pPr>
               <w:pStyle w:val="Compact"/>
+              <w:jc w:val="left"/>
             </w:pPr>
             <w:r>
               <w:t xml:space="preserve">3,5 %</w:t>
@@ -1062,8 +1114,8 @@
       </w:pPr>
       <w:r>
         <w:rPr>
-          <w:b/>
-          <w:bCs/>
+          <w:bCs/>
+          <w:b/>
         </w:rPr>
         <w:t xml:space="preserve">3.3</w:t>
       </w:r>
@@ -1088,8 +1140,8 @@
       </w:pPr>
       <w:r>
         <w:rPr>
-          <w:b/>
-          <w:bCs/>
+          <w:bCs/>
+          <w:b/>
         </w:rPr>
         <w:t xml:space="preserve">3.4</w:t>
       </w:r>
@@ -1106,8 +1158,8 @@
       </w:pPr>
       <w:r>
         <w:rPr>
-          <w:b/>
-          <w:bCs/>
+          <w:bCs/>
+          <w:b/>
         </w:rPr>
         <w:t xml:space="preserve">3.5</w:t>
       </w:r>
@@ -1123,8 +1175,8 @@
         <w:br w:type="page"/>
       </w:r>
     </w:p>
-    <w:bookmarkEnd w:id="15"/>
-    <w:bookmarkStart w:id="16" w:name="Xacd27a9a0599f387afb098c717c3b96c90edba0"/>
+    <w:bookmarkEnd w:id="26"/>
+    <w:bookmarkStart w:id="27" w:name="Xacd27a9a0599f387afb098c717c3b96c90edba0"/>
     <w:p>
       <w:pPr>
         <w:pStyle w:val="Heading1"/>
@@ -1139,8 +1191,8 @@
       </w:pPr>
       <w:r>
         <w:rPr>
-          <w:b/>
-          <w:bCs/>
+          <w:bCs/>
+          <w:b/>
         </w:rPr>
         <w:t xml:space="preserve">4.1</w:t>
       </w:r>
@@ -1157,8 +1209,8 @@
       </w:pPr>
       <w:r>
         <w:rPr>
-          <w:b/>
-          <w:bCs/>
+          <w:bCs/>
+          <w:b/>
         </w:rPr>
         <w:t xml:space="preserve">4.2</w:t>
       </w:r>
@@ -1175,8 +1227,8 @@
       </w:pPr>
       <w:r>
         <w:rPr>
-          <w:b/>
-          <w:bCs/>
+          <w:bCs/>
+          <w:b/>
         </w:rPr>
         <w:t xml:space="preserve">4.3</w:t>
       </w:r>
@@ -1192,8 +1244,8 @@
         <w:br w:type="page"/>
       </w:r>
     </w:p>
-    <w:bookmarkEnd w:id="16"/>
-    <w:bookmarkStart w:id="17" w:name="baupflicht-baubeschreibung"/>
+    <w:bookmarkEnd w:id="27"/>
+    <w:bookmarkStart w:id="28" w:name="baupflicht-baubeschreibung"/>
     <w:p>
       <w:pPr>
         <w:pStyle w:val="Heading1"/>
@@ -1208,8 +1260,8 @@
       </w:pPr>
       <w:r>
         <w:rPr>
-          <w:b/>
-          <w:bCs/>
+          <w:bCs/>
+          <w:b/>
         </w:rPr>
         <w:t xml:space="preserve">5.1</w:t>
       </w:r>
@@ -1226,8 +1278,8 @@
       </w:pPr>
       <w:r>
         <w:rPr>
-          <w:b/>
-          <w:bCs/>
+          <w:bCs/>
+          <w:b/>
         </w:rPr>
         <w:t xml:space="preserve">5.2</w:t>
       </w:r>
@@ -1260,8 +1312,8 @@
       </w:pPr>
       <w:r>
         <w:rPr>
-          <w:b/>
-          <w:bCs/>
+          <w:bCs/>
+          <w:b/>
         </w:rPr>
         <w:t xml:space="preserve">5.3</w:t>
       </w:r>
@@ -1294,8 +1346,8 @@
       </w:pPr>
       <w:r>
         <w:rPr>
-          <w:b/>
-          <w:bCs/>
+          <w:bCs/>
+          <w:b/>
         </w:rPr>
         <w:t xml:space="preserve">5.4</w:t>
       </w:r>
@@ -1312,8 +1364,8 @@
       </w:pPr>
       <w:r>
         <w:rPr>
-          <w:b/>
-          <w:bCs/>
+          <w:bCs/>
+          <w:b/>
         </w:rPr>
         <w:t xml:space="preserve">5.5</w:t>
       </w:r>
@@ -1330,8 +1382,8 @@
       </w:pPr>
       <w:r>
         <w:rPr>
-          <w:b/>
-          <w:bCs/>
+          <w:bCs/>
+          <w:b/>
         </w:rPr>
         <w:t xml:space="preserve">5.6</w:t>
       </w:r>
@@ -1346,8 +1398,8 @@
       </w:r>
       <w:r>
         <w:rPr>
-          <w:b/>
-          <w:bCs/>
+          <w:bCs/>
+          <w:b/>
         </w:rPr>
         <w:t xml:space="preserve">zum Tag der Erteilung der Baugenehmigung</w:t>
       </w:r>
@@ -1364,8 +1416,8 @@
       </w:pPr>
       <w:r>
         <w:rPr>
-          <w:b/>
-          <w:bCs/>
+          <w:bCs/>
+          <w:b/>
         </w:rPr>
         <w:t xml:space="preserve">5.7</w:t>
       </w:r>
@@ -1382,8 +1434,8 @@
       </w:pPr>
       <w:r>
         <w:rPr>
-          <w:b/>
-          <w:bCs/>
+          <w:bCs/>
+          <w:b/>
         </w:rPr>
         <w:t xml:space="preserve">5.8</w:t>
       </w:r>
@@ -1424,8 +1476,8 @@
       </w:pPr>
       <w:r>
         <w:rPr>
-          <w:b/>
-          <w:bCs/>
+          <w:bCs/>
+          <w:b/>
         </w:rPr>
         <w:t xml:space="preserve">5.9</w:t>
       </w:r>
@@ -1458,8 +1510,8 @@
       </w:pPr>
       <w:r>
         <w:rPr>
-          <w:b/>
-          <w:bCs/>
+          <w:bCs/>
+          <w:b/>
         </w:rPr>
         <w:t xml:space="preserve">5.10</w:t>
       </w:r>
@@ -1476,8 +1528,8 @@
       </w:pPr>
       <w:r>
         <w:rPr>
-          <w:b/>
-          <w:bCs/>
+          <w:bCs/>
+          <w:b/>
         </w:rPr>
         <w:t xml:space="preserve">5.11</w:t>
       </w:r>
@@ -1494,8 +1546,8 @@
       </w:pPr>
       <w:r>
         <w:rPr>
-          <w:b/>
-          <w:bCs/>
+          <w:bCs/>
+          <w:b/>
         </w:rPr>
         <w:t xml:space="preserve">5.12</w:t>
       </w:r>
@@ -1512,8 +1564,8 @@
       </w:pPr>
       <w:r>
         <w:rPr>
-          <w:b/>
-          <w:bCs/>
+          <w:bCs/>
+          <w:b/>
         </w:rPr>
         <w:t xml:space="preserve">5.13</w:t>
       </w:r>
@@ -1530,8 +1582,8 @@
       </w:pPr>
       <w:r>
         <w:rPr>
-          <w:b/>
-          <w:bCs/>
+          <w:bCs/>
+          <w:b/>
         </w:rPr>
         <w:t xml:space="preserve">5.14</w:t>
       </w:r>
@@ -1547,8 +1599,8 @@
         <w:br w:type="page"/>
       </w:r>
     </w:p>
-    <w:bookmarkEnd w:id="17"/>
-    <w:bookmarkStart w:id="18" w:name="Xf95df7023395c5238d26d19148165edbf6ad5ae"/>
+    <w:bookmarkEnd w:id="28"/>
+    <w:bookmarkStart w:id="29" w:name="Xf95df7023395c5238d26d19148165edbf6ad5ae"/>
     <w:p>
       <w:pPr>
         <w:pStyle w:val="Heading1"/>
@@ -1563,8 +1615,8 @@
       </w:pPr>
       <w:r>
         <w:rPr>
-          <w:b/>
-          <w:bCs/>
+          <w:bCs/>
+          <w:b/>
         </w:rPr>
         <w:t xml:space="preserve">6.1</w:t>
       </w:r>
@@ -1581,8 +1633,8 @@
       </w:pPr>
       <w:r>
         <w:rPr>
-          <w:b/>
-          <w:bCs/>
+          <w:bCs/>
+          <w:b/>
         </w:rPr>
         <w:t xml:space="preserve">6.2</w:t>
       </w:r>
@@ -1623,8 +1675,8 @@
       </w:pPr>
       <w:r>
         <w:rPr>
-          <w:b/>
-          <w:bCs/>
+          <w:bCs/>
+          <w:b/>
         </w:rPr>
         <w:t xml:space="preserve">6.3</w:t>
       </w:r>
@@ -1664,8 +1716,8 @@
         <w:br w:type="page"/>
       </w:r>
     </w:p>
-    <w:bookmarkEnd w:id="18"/>
-    <w:bookmarkStart w:id="19" w:name="erschließungskosten"/>
+    <w:bookmarkEnd w:id="29"/>
+    <w:bookmarkStart w:id="30" w:name="erschließungskosten"/>
     <w:p>
       <w:pPr>
         <w:pStyle w:val="Heading1"/>
@@ -1680,8 +1732,8 @@
       </w:pPr>
       <w:r>
         <w:rPr>
-          <w:b/>
-          <w:bCs/>
+          <w:bCs/>
+          <w:b/>
         </w:rPr>
         <w:t xml:space="preserve">7.1</w:t>
       </w:r>
@@ -1698,8 +1750,8 @@
       </w:pPr>
       <w:r>
         <w:rPr>
-          <w:b/>
-          <w:bCs/>
+          <w:bCs/>
+          <w:b/>
         </w:rPr>
         <w:t xml:space="preserve">7.2</w:t>
       </w:r>
@@ -1715,8 +1767,8 @@
         <w:br w:type="page"/>
       </w:r>
     </w:p>
-    <w:bookmarkEnd w:id="19"/>
-    <w:bookmarkStart w:id="20" w:name="zutritt-zur-baustelle"/>
+    <w:bookmarkEnd w:id="30"/>
+    <w:bookmarkStart w:id="31" w:name="zutritt-zur-baustelle"/>
     <w:p>
       <w:pPr>
         <w:pStyle w:val="Heading1"/>
@@ -1731,8 +1783,8 @@
       </w:pPr>
       <w:r>
         <w:rPr>
-          <w:b/>
-          <w:bCs/>
+          <w:bCs/>
+          <w:b/>
         </w:rPr>
         <w:t xml:space="preserve">8.1</w:t>
       </w:r>
@@ -1749,8 +1801,8 @@
       </w:pPr>
       <w:r>
         <w:rPr>
-          <w:b/>
-          <w:bCs/>
+          <w:bCs/>
+          <w:b/>
         </w:rPr>
         <w:t xml:space="preserve">8.2</w:t>
       </w:r>
@@ -1767,8 +1819,8 @@
       </w:pPr>
       <w:r>
         <w:rPr>
-          <w:b/>
-          <w:bCs/>
+          <w:bCs/>
+          <w:b/>
         </w:rPr>
         <w:t xml:space="preserve">8.3</w:t>
       </w:r>
@@ -1784,8 +1836,8 @@
         <w:br w:type="page"/>
       </w:r>
     </w:p>
-    <w:bookmarkEnd w:id="20"/>
-    <w:bookmarkStart w:id="21" w:name="haftung-mängelrechte-verzug-verjährung"/>
+    <w:bookmarkEnd w:id="31"/>
+    <w:bookmarkStart w:id="32" w:name="haftung-mängelrechte-verzug-verjährung"/>
     <w:p>
       <w:pPr>
         <w:pStyle w:val="Heading1"/>
@@ -1800,8 +1852,8 @@
       </w:pPr>
       <w:r>
         <w:rPr>
-          <w:b/>
-          <w:bCs/>
+          <w:bCs/>
+          <w:b/>
         </w:rPr>
         <w:t xml:space="preserve">9.1</w:t>
       </w:r>
@@ -1818,8 +1870,8 @@
       </w:pPr>
       <w:r>
         <w:rPr>
-          <w:b/>
-          <w:bCs/>
+          <w:bCs/>
+          <w:b/>
         </w:rPr>
         <w:t xml:space="preserve">9.2</w:t>
       </w:r>
@@ -1836,8 +1888,8 @@
       </w:pPr>
       <w:r>
         <w:rPr>
-          <w:b/>
-          <w:bCs/>
+          <w:bCs/>
+          <w:b/>
         </w:rPr>
         <w:t xml:space="preserve">9.3</w:t>
       </w:r>
@@ -1854,8 +1906,8 @@
       </w:pPr>
       <w:r>
         <w:rPr>
-          <w:b/>
-          <w:bCs/>
+          <w:bCs/>
+          <w:b/>
         </w:rPr>
         <w:t xml:space="preserve">9.4</w:t>
       </w:r>
@@ -1868,11 +1920,11 @@
     </w:p>
     <w:p>
       <w:pPr>
-        <w:pStyle w:val="Compact"/>
         <w:numPr>
           <w:ilvl w:val="0"/>
           <w:numId w:val="1002"/>
         </w:numPr>
+        <w:pStyle w:val="Compact"/>
       </w:pPr>
       <w:r>
         <w:t xml:space="preserve">Der Käufer kann zuerst nur Nacherfüllung verlangen. Ist das Verlangen der Nacherfüllung unzumutbar, verweigert der Verkäufer die Nacherfüllung oder schlägt diese dreimal fehl, kann der Käufer — jeweils bei Vorliegen der gesetzlichen Voraussetzungen — den Kaufpreis angemessen mindern oder vom Vertrag zurücktreten.</w:t>
@@ -1880,11 +1932,11 @@
     </w:p>
     <w:p>
       <w:pPr>
-        <w:pStyle w:val="Compact"/>
         <w:numPr>
           <w:ilvl w:val="0"/>
           <w:numId w:val="1002"/>
         </w:numPr>
+        <w:pStyle w:val="Compact"/>
       </w:pPr>
       <w:r>
         <w:t xml:space="preserve">Das Selbstvornahmerecht des Käufers nach § 637 BGB ist ausgeschlossen.</w:t>
@@ -1892,11 +1944,11 @@
     </w:p>
     <w:p>
       <w:pPr>
-        <w:pStyle w:val="Compact"/>
         <w:numPr>
           <w:ilvl w:val="0"/>
           <w:numId w:val="1002"/>
         </w:numPr>
+        <w:pStyle w:val="Compact"/>
       </w:pPr>
       <w:r>
         <w:t xml:space="preserve">Mängel sind binnen einer Ausschlussfrist von 14 Kalendertagen nach Entdeckung schriftlich gegenüber dem Verkäufer per Einwurf-Einschreiben zu rügen. Nach Ablauf dieser Frist sind sämtliche Ansprüche und Rechte wegen des Mangels ausgeschlossen.</w:t>
@@ -1904,11 +1956,11 @@
     </w:p>
     <w:p>
       <w:pPr>
-        <w:pStyle w:val="Compact"/>
         <w:numPr>
           <w:ilvl w:val="0"/>
           <w:numId w:val="1002"/>
         </w:numPr>
+        <w:pStyle w:val="Compact"/>
       </w:pPr>
       <w:r>
         <w:t xml:space="preserve">Die Verjährungsfrist für Mängelansprüche beträgt zwei Jahre ab schriftlicher Abnahmebestätigung durch den Verkäufer.</w:t>
@@ -1916,11 +1968,11 @@
     </w:p>
     <w:p>
       <w:pPr>
-        <w:pStyle w:val="Compact"/>
         <w:numPr>
           <w:ilvl w:val="0"/>
           <w:numId w:val="1002"/>
         </w:numPr>
+        <w:pStyle w:val="Compact"/>
       </w:pPr>
       <w:r>
         <w:t xml:space="preserve">Mängelbeseitigung erfolgt durch vom Verkäufer benannte und beauftragte Handwerker. Die Beauftragung anderer Handwerker durch den Käufer entbindet den Verkäufer von jeder Verpflichtung.</w:t>
@@ -1932,8 +1984,8 @@
       </w:pPr>
       <w:r>
         <w:rPr>
-          <w:b/>
-          <w:bCs/>
+          <w:bCs/>
+          <w:b/>
         </w:rPr>
         <w:t xml:space="preserve">9.5</w:t>
       </w:r>
@@ -1950,8 +2002,8 @@
       </w:pPr>
       <w:r>
         <w:rPr>
-          <w:b/>
-          <w:bCs/>
+          <w:bCs/>
+          <w:b/>
         </w:rPr>
         <w:t xml:space="preserve">9.6</w:t>
       </w:r>
@@ -1967,8 +2019,8 @@
         <w:br w:type="page"/>
       </w:r>
     </w:p>
-    <w:bookmarkEnd w:id="21"/>
-    <w:bookmarkStart w:id="22" w:name="vormerkung"/>
+    <w:bookmarkEnd w:id="32"/>
+    <w:bookmarkStart w:id="33" w:name="vormerkung"/>
     <w:p>
       <w:pPr>
         <w:pStyle w:val="Heading1"/>
@@ -1983,8 +2035,8 @@
       </w:pPr>
       <w:r>
         <w:rPr>
-          <w:b/>
-          <w:bCs/>
+          <w:bCs/>
+          <w:b/>
         </w:rPr>
         <w:t xml:space="preserve">10.1</w:t>
       </w:r>
@@ -2001,8 +2053,8 @@
       </w:pPr>
       <w:r>
         <w:rPr>
-          <w:b/>
-          <w:bCs/>
+          <w:bCs/>
+          <w:b/>
         </w:rPr>
         <w:t xml:space="preserve">10.2</w:t>
       </w:r>
@@ -2019,8 +2071,8 @@
       </w:pPr>
       <w:r>
         <w:rPr>
-          <w:b/>
-          <w:bCs/>
+          <w:bCs/>
+          <w:b/>
         </w:rPr>
         <w:t xml:space="preserve">10.3</w:t>
       </w:r>
@@ -2036,8 +2088,8 @@
         <w:br w:type="page"/>
       </w:r>
     </w:p>
-    <w:bookmarkEnd w:id="22"/>
-    <w:bookmarkStart w:id="23" w:name="auflassung"/>
+    <w:bookmarkEnd w:id="33"/>
+    <w:bookmarkStart w:id="34" w:name="auflassung"/>
     <w:p>
       <w:pPr>
         <w:pStyle w:val="Heading1"/>
@@ -2059,8 +2111,8 @@
         <w:br w:type="page"/>
       </w:r>
     </w:p>
-    <w:bookmarkEnd w:id="23"/>
-    <w:bookmarkStart w:id="24" w:name="vollmachten"/>
+    <w:bookmarkEnd w:id="34"/>
+    <w:bookmarkStart w:id="35" w:name="vollmachten"/>
     <w:p>
       <w:pPr>
         <w:pStyle w:val="Heading1"/>
@@ -2075,8 +2127,8 @@
       </w:pPr>
       <w:r>
         <w:rPr>
-          <w:b/>
-          <w:bCs/>
+          <w:bCs/>
+          <w:b/>
         </w:rPr>
         <w:t xml:space="preserve">12.1</w:t>
       </w:r>
@@ -2093,8 +2145,8 @@
       </w:pPr>
       <w:r>
         <w:rPr>
-          <w:b/>
-          <w:bCs/>
+          <w:bCs/>
+          <w:b/>
         </w:rPr>
         <w:t xml:space="preserve">12.2</w:t>
       </w:r>
@@ -2111,8 +2163,8 @@
       </w:pPr>
       <w:r>
         <w:rPr>
-          <w:b/>
-          <w:bCs/>
+          <w:bCs/>
+          <w:b/>
         </w:rPr>
         <w:t xml:space="preserve">12.3</w:t>
       </w:r>
@@ -2128,8 +2180,8 @@
         <w:br w:type="page"/>
       </w:r>
     </w:p>
-    <w:bookmarkEnd w:id="24"/>
-    <w:bookmarkStart w:id="25" w:name="schlussbestimmungen"/>
+    <w:bookmarkEnd w:id="35"/>
+    <w:bookmarkStart w:id="36" w:name="schlussbestimmungen"/>
     <w:p>
       <w:pPr>
         <w:pStyle w:val="Heading1"/>
@@ -2144,8 +2196,8 @@
       </w:pPr>
       <w:r>
         <w:rPr>
-          <w:b/>
-          <w:bCs/>
+          <w:bCs/>
+          <w:b/>
         </w:rPr>
         <w:t xml:space="preserve">13.1</w:t>
       </w:r>
@@ -2162,8 +2214,8 @@
       </w:pPr>
       <w:r>
         <w:rPr>
-          <w:b/>
-          <w:bCs/>
+          <w:bCs/>
+          <w:b/>
         </w:rPr>
         <w:t xml:space="preserve">13.2</w:t>
       </w:r>
@@ -2180,8 +2232,8 @@
       </w:pPr>
       <w:r>
         <w:rPr>
-          <w:b/>
-          <w:bCs/>
+          <w:bCs/>
+          <w:b/>
         </w:rPr>
         <w:t xml:space="preserve">13.3</w:t>
       </w:r>
@@ -2198,8 +2250,8 @@
       </w:pPr>
       <w:r>
         <w:rPr>
-          <w:b/>
-          <w:bCs/>
+          <w:bCs/>
+          <w:b/>
         </w:rPr>
         <w:t xml:space="preserve">13.4</w:t>
       </w:r>
@@ -2216,8 +2268,8 @@
       </w:pPr>
       <w:r>
         <w:rPr>
-          <w:b/>
-          <w:bCs/>
+          <w:bCs/>
+          <w:b/>
         </w:rPr>
         <w:t xml:space="preserve">13.5</w:t>
       </w:r>
@@ -2233,8 +2285,8 @@
         <w:br w:type="page"/>
       </w:r>
     </w:p>
-    <w:bookmarkEnd w:id="25"/>
-    <w:bookmarkStart w:id="26" w:name="belehrungen"/>
+    <w:bookmarkEnd w:id="36"/>
+    <w:bookmarkStart w:id="37" w:name="belehrungen"/>
     <w:p>
       <w:pPr>
         <w:pStyle w:val="Heading1"/>
@@ -2253,11 +2305,11 @@
     </w:p>
     <w:p>
       <w:pPr>
-        <w:pStyle w:val="Compact"/>
         <w:numPr>
           <w:ilvl w:val="0"/>
           <w:numId w:val="1003"/>
         </w:numPr>
+        <w:pStyle w:val="Compact"/>
       </w:pPr>
       <w:r>
         <w:t xml:space="preserve">den Inhalt und die Bedeutung dieses Vertrages,</w:t>
@@ -2265,11 +2317,11 @@
     </w:p>
     <w:p>
       <w:pPr>
-        <w:pStyle w:val="Compact"/>
         <w:numPr>
           <w:ilvl w:val="0"/>
           <w:numId w:val="1003"/>
         </w:numPr>
+        <w:pStyle w:val="Compact"/>
       </w:pPr>
       <w:r>
         <w:t xml:space="preserve">die Bedeutung der Bezugnahme nach § 13a BeurkG,</w:t>
@@ -2277,11 +2329,11 @@
     </w:p>
     <w:p>
       <w:pPr>
-        <w:pStyle w:val="Compact"/>
         <w:numPr>
           <w:ilvl w:val="0"/>
           <w:numId w:val="1003"/>
         </w:numPr>
+        <w:pStyle w:val="Compact"/>
       </w:pPr>
       <w:r>
         <w:t xml:space="preserve">die Eigentumsübertragung erst mit Eintragung im Grundbuch,</w:t>
@@ -2289,11 +2341,11 @@
     </w:p>
     <w:p>
       <w:pPr>
-        <w:pStyle w:val="Compact"/>
         <w:numPr>
           <w:ilvl w:val="0"/>
           <w:numId w:val="1003"/>
         </w:numPr>
+        <w:pStyle w:val="Compact"/>
       </w:pPr>
       <w:r>
         <w:t xml:space="preserve">die Bedeutung der Auflassungsvormerkung,</w:t>
@@ -2301,11 +2353,11 @@
     </w:p>
     <w:p>
       <w:pPr>
-        <w:pStyle w:val="Compact"/>
         <w:numPr>
           <w:ilvl w:val="0"/>
           <w:numId w:val="1003"/>
         </w:numPr>
+        <w:pStyle w:val="Compact"/>
       </w:pPr>
       <w:r>
         <w:t xml:space="preserve">die Bedeutung der Belastungsvollmacht,</w:t>
@@ -2313,11 +2365,11 @@
     </w:p>
     <w:p>
       <w:pPr>
-        <w:pStyle w:val="Compact"/>
         <w:numPr>
           <w:ilvl w:val="0"/>
           <w:numId w:val="1003"/>
         </w:numPr>
+        <w:pStyle w:val="Compact"/>
       </w:pPr>
       <w:r>
         <w:t xml:space="preserve">die gesetzliche Verjährungsfrist für Mängelansprüche im Werkvertragsrecht,</w:t>
@@ -2325,11 +2377,11 @@
     </w:p>
     <w:p>
       <w:pPr>
-        <w:pStyle w:val="Compact"/>
         <w:numPr>
           <w:ilvl w:val="0"/>
           <w:numId w:val="1003"/>
         </w:numPr>
+        <w:pStyle w:val="Compact"/>
       </w:pPr>
       <w:r>
         <w:t xml:space="preserve">die Möglichkeit, eigene technische Berater hinzuzuziehen, wobei der Notar keine technische Prüfung des Baugrunds, der Bauüberwachung, der Fachplanung oder der Wirtschaftlichkeit von Betriebs- und Wartungsverträgen vorgenommen hat.</w:t>
@@ -2348,8 +2400,8 @@
         <w:br w:type="page"/>
       </w:r>
     </w:p>
-    <w:bookmarkEnd w:id="26"/>
-    <w:bookmarkStart w:id="27" w:name="X4f67cac4119bae2ce85a655d240d61c8e478a46"/>
+    <w:bookmarkEnd w:id="37"/>
+    <w:bookmarkStart w:id="38" w:name="X4f67cac4119bae2ce85a655d240d61c8e478a46"/>
     <w:p>
       <w:pPr>
         <w:pStyle w:val="Heading1"/>
@@ -2364,8 +2416,8 @@
       </w:pPr>
       <w:r>
         <w:rPr>
-          <w:b/>
-          <w:bCs/>
+          <w:bCs/>
+          <w:b/>
         </w:rPr>
         <w:t xml:space="preserve">Bezugsurkunde 1</w:t>
       </w:r>
@@ -2382,8 +2434,8 @@
       </w:pPr>
       <w:r>
         <w:rPr>
-          <w:b/>
-          <w:bCs/>
+          <w:bCs/>
+          <w:b/>
         </w:rPr>
         <w:t xml:space="preserve">Anhang a</w:t>
       </w:r>
@@ -2400,8 +2452,8 @@
       </w:pPr>
       <w:r>
         <w:rPr>
-          <w:b/>
-          <w:bCs/>
+          <w:bCs/>
+          <w:b/>
         </w:rPr>
         <w:t xml:space="preserve">Lose übergebene Unterlagen (nicht Gegenstand der Beurkundung):</w:t>
       </w:r>
@@ -2425,8 +2477,8 @@
         <w:br w:type="page"/>
       </w:r>
     </w:p>
-    <w:bookmarkEnd w:id="27"/>
-    <w:bookmarkStart w:id="28" w:name="geschäftswert-und-kosten"/>
+    <w:bookmarkEnd w:id="38"/>
+    <w:bookmarkStart w:id="39" w:name="geschäftswert-und-kosten"/>
     <w:p>
       <w:pPr>
         <w:pStyle w:val="Heading1"/>
@@ -2448,8 +2500,8 @@
         <w:br w:type="page"/>
       </w:r>
     </w:p>
-    <w:bookmarkEnd w:id="28"/>
-    <w:bookmarkStart w:id="29" w:name="unterschriften"/>
+    <w:bookmarkEnd w:id="39"/>
+    <w:bookmarkStart w:id="40" w:name="unterschriften"/>
     <w:p>
       <w:pPr>
         <w:pStyle w:val="Heading1"/>
@@ -2562,12 +2614,8 @@
         <w:t xml:space="preserve">Dr. Adalbert von Sickingen-Querfurt, Notar</w:t>
       </w:r>
     </w:p>
-    <w:bookmarkEnd w:id="29"/>
-    <w:sectPr>
-      <w:footnotePr>
-        <w:numRestart w:val="eachSect"/>
-      </w:footnotePr>
-    </w:sectPr>
+    <w:bookmarkEnd w:id="40"/>
+    <w:sectPr/>
   </w:body>
 </w:document>
 </file>
@@ -2598,14 +2646,14 @@
 <file path=word/numbering.xml><?xml version="1.0" encoding="utf-8"?>
 <w:numbering xmlns:w="http://schemas.openxmlformats.org/wordprocessingml/2006/main">
   <w:abstractNum w:abstractNumId="990">
-    <w:nsid w:val="0000A990"/>
+    <w:nsid w:val="A990"/>
     <w:multiLevelType w:val="multilevel"/>
     <w:lvl w:ilvl="0">
       <w:numFmt w:val="bullet"/>
       <w:lvlText w:val=" "/>
       <w:lvlJc w:val="left"/>
       <w:pPr>
-        <w:ind w:left="720" w:hanging="360"/>
+        <w:ind w:left="720" w:hanging="480"/>
       </w:pPr>
     </w:lvl>
     <w:lvl w:ilvl="1">
@@ -2613,7 +2661,7 @@
       <w:lvlText w:val=" "/>
       <w:lvlJc w:val="left"/>
       <w:pPr>
-        <w:ind w:left="1440" w:hanging="360"/>
+        <w:ind w:left="1440" w:hanging="480"/>
       </w:pPr>
     </w:lvl>
     <w:lvl w:ilvl="2">
@@ -2621,7 +2669,7 @@
       <w:lvlText w:val=" "/>
       <w:lvlJc w:val="left"/>
       <w:pPr>
-        <w:ind w:left="2160" w:hanging="360"/>
+        <w:ind w:left="2160" w:hanging="480"/>
       </w:pPr>
     </w:lvl>
     <w:lvl w:ilvl="3">
@@ -2629,7 +2677,7 @@
       <w:lvlText w:val=" "/>
       <w:lvlJc w:val="left"/>
       <w:pPr>
-        <w:ind w:left="2880" w:hanging="360"/>
+        <w:ind w:left="2880" w:hanging="480"/>
       </w:pPr>
     </w:lvl>
     <w:lvl w:ilvl="4">
@@ -2637,7 +2685,7 @@
       <w:lvlText w:val=" "/>
       <w:lvlJc w:val="left"/>
       <w:pPr>
-        <w:ind w:left="3600" w:hanging="360"/>
+        <w:ind w:left="3600" w:hanging="480"/>
       </w:pPr>
     </w:lvl>
     <w:lvl w:ilvl="5">
@@ -2645,7 +2693,7 @@
       <w:lvlText w:val=" "/>
       <w:lvlJc w:val="left"/>
       <w:pPr>
-        <w:ind w:left="4320" w:hanging="360"/>
+        <w:ind w:left="4320" w:hanging="480"/>
       </w:pPr>
     </w:lvl>
     <w:lvl w:ilvl="6">
@@ -2653,7 +2701,7 @@
       <w:lvlText w:val=" "/>
       <w:lvlJc w:val="left"/>
       <w:pPr>
-        <w:ind w:left="5040" w:hanging="360"/>
+        <w:ind w:left="5040" w:hanging="480"/>
       </w:pPr>
     </w:lvl>
     <w:lvl w:ilvl="7">
@@ -2661,7 +2709,7 @@
       <w:lvlText w:val=" "/>
       <w:lvlJc w:val="left"/>
       <w:pPr>
-        <w:ind w:left="5760" w:hanging="360"/>
+        <w:ind w:left="5760" w:hanging="480"/>
       </w:pPr>
     </w:lvl>
     <w:lvl w:ilvl="8">
@@ -2669,12 +2717,12 @@
       <w:lvlText w:val=" "/>
       <w:lvlJc w:val="left"/>
       <w:pPr>
-        <w:ind w:left="6480" w:hanging="360"/>
+        <w:ind w:left="6480" w:hanging="480"/>
       </w:pPr>
     </w:lvl>
   </w:abstractNum>
   <w:abstractNum w:abstractNumId="99721">
-    <w:nsid w:val="00A99721"/>
+    <w:nsid w:val="A99721"/>
     <w:multiLevelType w:val="multilevel"/>
     <w:lvl w:ilvl="0">
       <w:start w:val="1"/>
@@ -2682,7 +2730,7 @@
       <w:lvlText w:val="%1)"/>
       <w:lvlJc w:val="left"/>
       <w:pPr>
-        <w:ind w:left="720" w:hanging="360"/>
+        <w:ind w:left="720" w:hanging="480"/>
       </w:pPr>
     </w:lvl>
     <w:lvl w:ilvl="1">
@@ -2691,7 +2739,7 @@
       <w:lvlText w:val="%2)"/>
       <w:lvlJc w:val="left"/>
       <w:pPr>
-        <w:ind w:left="1440" w:hanging="360"/>
+        <w:ind w:left="1440" w:hanging="480"/>
       </w:pPr>
     </w:lvl>
     <w:lvl w:ilvl="2">
@@ -2700,7 +2748,7 @@
       <w:lvlText w:val="%3)"/>
       <w:lvlJc w:val="left"/>
       <w:pPr>
-        <w:ind w:left="2160" w:hanging="360"/>
+        <w:ind w:left="2160" w:hanging="480"/>
       </w:pPr>
     </w:lvl>
     <w:lvl w:ilvl="3">
@@ -2709,7 +2757,7 @@
       <w:lvlText w:val="%4)"/>
       <w:lvlJc w:val="left"/>
       <w:pPr>
-        <w:ind w:left="2880" w:hanging="360"/>
+        <w:ind w:left="2880" w:hanging="480"/>
       </w:pPr>
     </w:lvl>
     <w:lvl w:ilvl="4">
@@ -2718,7 +2766,7 @@
       <w:lvlText w:val="%5)"/>
       <w:lvlJc w:val="left"/>
       <w:pPr>
-        <w:ind w:left="3600" w:hanging="360"/>
+        <w:ind w:left="3600" w:hanging="480"/>
       </w:pPr>
     </w:lvl>
     <w:lvl w:ilvl="5">
@@ -2727,7 +2775,7 @@
       <w:lvlText w:val="%6)"/>
       <w:lvlJc w:val="left"/>
       <w:pPr>
-        <w:ind w:left="4320" w:hanging="360"/>
+        <w:ind w:left="4320" w:hanging="480"/>
       </w:pPr>
     </w:lvl>
     <w:lvl w:ilvl="6">
@@ -2736,7 +2784,7 @@
       <w:lvlText w:val="%7)"/>
       <w:lvlJc w:val="left"/>
       <w:pPr>
-        <w:ind w:left="5040" w:hanging="360"/>
+        <w:ind w:left="5040" w:hanging="480"/>
       </w:pPr>
     </w:lvl>
     <w:lvl w:ilvl="7">
@@ -2745,7 +2793,7 @@
       <w:lvlText w:val="%8)"/>
       <w:lvlJc w:val="left"/>
       <w:pPr>
-        <w:ind w:left="5760" w:hanging="360"/>
+        <w:ind w:left="5760" w:hanging="480"/>
       </w:pPr>
     </w:lvl>
     <w:lvl w:ilvl="8">
@@ -2754,111 +2802,84 @@
       <w:lvlText w:val="%9)"/>
       <w:lvlJc w:val="left"/>
       <w:pPr>
-        <w:ind w:left="6480" w:hanging="360"/>
+        <w:ind w:left="6480" w:hanging="480"/>
       </w:pPr>
     </w:lvl>
   </w:abstractNum>
   <w:abstractNum w:abstractNumId="991">
-    <w:nsid w:val="0000A991"/>
+    <w:nsid w:val="A991"/>
     <w:multiLevelType w:val="multilevel"/>
     <w:lvl w:ilvl="0">
       <w:numFmt w:val="bullet"/>
-      <w:lvlText w:val=""/>
+      <w:lvlText w:val="•"/>
       <w:lvlJc w:val="left"/>
       <w:pPr>
-        <w:ind w:left="720" w:hanging="360"/>
-      </w:pPr>
-      <w:rPr>
-        <w:rFonts w:ascii="Symbol" w:hAnsi="Symbol" w:cs="Symbol" w:hint="default"/>
-      </w:rPr>
+        <w:ind w:left="720" w:hanging="480"/>
+      </w:pPr>
     </w:lvl>
     <w:lvl w:ilvl="1">
       <w:numFmt w:val="bullet"/>
-      <w:lvlText w:val="o"/>
+      <w:lvlText w:val="–"/>
       <w:lvlJc w:val="left"/>
       <w:pPr>
-        <w:ind w:left="1440" w:hanging="360"/>
-      </w:pPr>
-      <w:rPr>
-        <w:rFonts w:ascii="Courier New" w:hAnsi="Courier New" w:cs="Courier New" w:hint="default"/>
-      </w:rPr>
+        <w:ind w:left="1440" w:hanging="480"/>
+      </w:pPr>
     </w:lvl>
     <w:lvl w:ilvl="2">
       <w:numFmt w:val="bullet"/>
-      <w:lvlText w:val=""/>
+      <w:lvlText w:val="•"/>
       <w:lvlJc w:val="left"/>
       <w:pPr>
-        <w:ind w:left="2160" w:hanging="360"/>
-      </w:pPr>
-      <w:rPr>
-        <w:rFonts w:ascii="Wingdings" w:hAnsi="Wingdings" w:cs="Wingdings" w:hint="default"/>
-      </w:rPr>
+        <w:ind w:left="2160" w:hanging="480"/>
+      </w:pPr>
     </w:lvl>
     <w:lvl w:ilvl="3">
       <w:numFmt w:val="bullet"/>
-      <w:lvlText w:val=""/>
+      <w:lvlText w:val="–"/>
       <w:lvlJc w:val="left"/>
       <w:pPr>
-        <w:ind w:left="2880" w:hanging="360"/>
-      </w:pPr>
-      <w:rPr>
-        <w:rFonts w:ascii="Symbol" w:hAnsi="Symbol" w:cs="Symbol" w:hint="default"/>
-      </w:rPr>
+        <w:ind w:left="2880" w:hanging="480"/>
+      </w:pPr>
     </w:lvl>
     <w:lvl w:ilvl="4">
       <w:numFmt w:val="bullet"/>
-      <w:lvlText w:val="o"/>
+      <w:lvlText w:val="•"/>
       <w:lvlJc w:val="left"/>
       <w:pPr>
-        <w:ind w:left="3600" w:hanging="360"/>
-      </w:pPr>
-      <w:rPr>
-        <w:rFonts w:ascii="Courier New" w:hAnsi="Courier New" w:cs="Courier New" w:hint="default"/>
-      </w:rPr>
+        <w:ind w:left="3600" w:hanging="480"/>
+      </w:pPr>
     </w:lvl>
     <w:lvl w:ilvl="5">
       <w:numFmt w:val="bullet"/>
-      <w:lvlText w:val=""/>
+      <w:lvlText w:val="–"/>
       <w:lvlJc w:val="left"/>
       <w:pPr>
-        <w:ind w:left="4320" w:hanging="360"/>
-      </w:pPr>
-      <w:rPr>
-        <w:rFonts w:ascii="Wingdings" w:hAnsi="Wingdings" w:cs="Wingdings" w:hint="default"/>
-      </w:rPr>
+        <w:ind w:left="4320" w:hanging="480"/>
+      </w:pPr>
     </w:lvl>
     <w:lvl w:ilvl="6">
       <w:numFmt w:val="bullet"/>
-      <w:lvlText w:val=""/>
+      <w:lvlText w:val="•"/>
       <w:lvlJc w:val="left"/>
       <w:pPr>
-        <w:ind w:left="5040" w:hanging="360"/>
-      </w:pPr>
-      <w:rPr>
-        <w:rFonts w:ascii="Symbol" w:hAnsi="Symbol" w:cs="Symbol" w:hint="default"/>
-      </w:rPr>
+        <w:ind w:left="5040" w:hanging="480"/>
+      </w:pPr>
     </w:lvl>
     <w:lvl w:ilvl="7">
       <w:numFmt w:val="bullet"/>
-      <w:lvlText w:val="o"/>
+      <w:lvlText w:val="–"/>
       <w:lvlJc w:val="left"/>
       <w:pPr>
-        <w:ind w:left="5760" w:hanging="360"/>
-      </w:pPr>
-      <w:rPr>
-        <w:rFonts w:ascii="Courier New" w:hAnsi="Courier New" w:cs="Courier New" w:hint="default"/>
-      </w:rPr>
+        <w:ind w:left="5760" w:hanging="480"/>
+      </w:pPr>
     </w:lvl>
     <w:lvl w:ilvl="8">
       <w:numFmt w:val="bullet"/>
-      <w:lvlText w:val=""/>
+      <w:lvlText w:val="•"/>
       <w:lvlJc w:val="left"/>
       <w:pPr>
-        <w:ind w:left="6480" w:hanging="360"/>
-      </w:pPr>
-      <w:rPr>
-        <w:rFonts w:ascii="Wingdings" w:hAnsi="Wingdings" w:cs="Wingdings" w:hint="default"/>
-      </w:rPr>
+        <w:ind w:left="6480" w:hanging="480"/>
+      </w:pPr>
     </w:lvl>
   </w:abstractNum>
   <w:num w:numId="1000">
@@ -2908,10 +2929,10 @@
   <w:docDefaults>
     <w:rPrDefault>
       <w:rPr>
-        <w:rFonts w:asciiTheme="minorHAnsi" w:cstheme="minorBidi" w:eastAsiaTheme="minorEastAsia" w:hAnsiTheme="minorHAnsi"/>
+        <w:rFonts w:asciiTheme="minorHAnsi" w:cstheme="minorBidi" w:eastAsiaTheme="minorHAnsi" w:hAnsiTheme="minorHAnsi"/>
         <w:sz w:val="24"/>
         <w:szCs w:val="24"/>
-        <w:lang w:bidi="ar-SA" w:eastAsia="zh-CN" w:val="en-US"/>
+        <w:lang w:bidi="ar-SA" w:eastAsia="en-US" w:val="en-US"/>
       </w:rPr>
     </w:rPrDefault>
     <w:pPrDefault>
@@ -2929,10 +2950,10 @@
     <w:name w:val="Body Text"/>
     <w:basedOn w:val="Normal"/>
     <w:link w:val="BodyTextChar"/>
-    <w:qFormat/>
     <w:pPr>
       <w:spacing w:after="180" w:before="180"/>
     </w:pPr>
+    <w:qFormat/>
   </w:style>
   <w:style w:customStyle="1" w:styleId="FirstParagraph" w:type="paragraph">
     <w:name w:val="First Paragraph"/>
@@ -2952,94 +2973,57 @@
     <w:name w:val="Title"/>
     <w:basedOn w:val="Normal"/>
     <w:next w:val="BodyText"/>
-    <w:link w:val="TitleChar"/>
-    <w:uiPriority w:val="10"/>
     <w:qFormat/>
-    <w:rsid w:val="00A10FD9"/>
     <w:pPr>
-      <w:spacing w:after="80" w:line="240" w:lineRule="auto"/>
-      <w:contextualSpacing/>
+      <w:keepNext/>
+      <w:keepLines/>
+      <w:spacing w:after="240" w:before="480"/>
       <w:jc w:val="center"/>
     </w:pPr>
     <w:rPr>
       <w:rFonts w:asciiTheme="majorHAnsi" w:cstheme="majorBidi" w:eastAsiaTheme="majorEastAsia" w:hAnsiTheme="majorHAnsi"/>
-      <w:sz w:val="56"/>
-      <w:szCs w:val="56"/>
-    </w:rPr>
-  </w:style>
-  <w:style w:customStyle="1" w:styleId="TitleChar" w:type="character">
-    <w:name w:val="Title Char"/>
-    <w:basedOn w:val="DefaultParagraphFont"/>
-    <w:link w:val="Title"/>
-    <w:uiPriority w:val="10"/>
-    <w:rsid w:val="00A10FD9"/>
-    <w:rPr>
-      <w:rFonts w:asciiTheme="majorHAnsi" w:cstheme="majorBidi" w:eastAsiaTheme="majorEastAsia" w:hAnsiTheme="majorHAnsi"/>
-      <w:sz w:val="56"/>
-      <w:szCs w:val="56"/>
+      <w:b/>
+      <w:bCs/>
+      <w:color w:themeColor="accent1" w:themeShade="B5" w:val="345A8A"/>
+      <w:sz w:val="36"/>
+      <w:szCs w:val="36"/>
     </w:rPr>
   </w:style>
   <w:style w:styleId="Subtitle" w:type="paragraph">
     <w:name w:val="Subtitle"/>
-    <w:basedOn w:val="Title"/>
-    <w:next w:val="BodyText"/>
-    <w:link w:val="SubtitleChar"/>
-    <w:uiPriority w:val="11"/>
-    <w:qFormat/>
-    <w:rsid w:val="00A10FD9"/>
-    <w:pPr>
-      <w:numPr>
-        <w:ilvl w:val="1"/>
-      </w:numPr>
-    </w:pPr>
-    <w:rPr>
-      <w:rFonts w:cstheme="majorBidi" w:eastAsiaTheme="majorEastAsia"/>
-      <w:spacing w:val="15"/>
-      <w:sz w:val="28"/>
-      <w:szCs w:val="28"/>
-    </w:rPr>
-  </w:style>
-  <w:style w:customStyle="1" w:styleId="SubtitleChar" w:type="character">
-    <w:name w:val="Subtitle Char"/>
-    <w:basedOn w:val="DefaultParagraphFont"/>
-    <w:link w:val="Subtitle"/>
-    <w:uiPriority w:val="11"/>
-    <w:rsid w:val="00A10FD9"/>
-    <w:rPr>
-      <w:rFonts w:cstheme="majorBidi" w:eastAsiaTheme="majorEastAsia"/>
-      <w:color w:themeColor="text1" w:themeTint="A6" w:val="595959"/>
-      <w:spacing w:val="15"/>
-      <w:sz w:val="28"/>
-      <w:szCs w:val="28"/>
-    </w:rPr>
-  </w:style>
-  <w:style w:customStyle="1" w:styleId="Author" w:type="paragraph">
-    <w:name w:val="Author"/>
     <w:basedOn w:val="Title"/>
     <w:next w:val="BodyText"/>
     <w:qFormat/>
     <w:pPr>
       <w:keepNext/>
       <w:keepLines/>
+      <w:spacing w:after="240" w:before="240"/>
+      <w:jc w:val="center"/>
     </w:pPr>
     <w:rPr>
-      <w:sz w:val="24"/>
-      <w:szCs w:val="24"/>
-    </w:rPr>
-  </w:style>
-  <w:style w:styleId="Date" w:type="paragraph">
-    <w:name w:val="Date"/>
-    <w:basedOn w:val="Title"/>
+      <w:sz w:val="30"/>
+      <w:szCs w:val="30"/>
+    </w:rPr>
+  </w:style>
+  <w:style w:customStyle="1" w:styleId="Author" w:type="paragraph">
+    <w:name w:val="Author"/>
     <w:next w:val="BodyText"/>
     <w:qFormat/>
     <w:pPr>
       <w:keepNext/>
       <w:keepLines/>
+      <w:jc w:val="center"/>
     </w:pPr>
-    <w:rPr>
-      <w:sz w:val="24"/>
-      <w:szCs w:val="24"/>
-    </w:rPr>
+  </w:style>
+  <w:style w:styleId="Date" w:type="paragraph">
+    <w:name w:val="Date"/>
+    <w:next w:val="BodyText"/>
+    <w:qFormat/>
+    <w:pPr>
+      <w:keepNext/>
+      <w:keepLines/>
+      <w:jc w:val="center"/>
+    </w:pPr>
   </w:style>
   <w:style w:customStyle="1" w:styleId="AbstractTitle" w:type="paragraph">
     <w:name w:val="Abstract Title"/>
@@ -3049,13 +3033,15 @@
     <w:pPr>
       <w:keepNext/>
       <w:keepLines/>
+      <w:jc w:val="center"/>
       <w:spacing w:after="0" w:before="300"/>
-      <w:jc w:val="center"/>
     </w:pPr>
     <w:rPr>
-      <w:b/>
       <w:sz w:val="20"/>
       <w:szCs w:val="20"/>
+      <w:b/>
+      <w:color w:val="345A8A"/>
+      &gt;
     </w:rPr>
   </w:style>
   <w:style w:customStyle="1" w:styleId="Abstract" w:type="paragraph">
@@ -3082,321 +3068,191 @@
     <w:rPr/>
   </w:style>
   <w:style w:styleId="Heading1" w:type="paragraph">
-    <w:name w:val="heading 1"/>
+    <w:name w:val="Heading 1"/>
     <w:basedOn w:val="Normal"/>
     <w:next w:val="BodyText"/>
-    <w:link w:val="Heading1Char"/>
     <w:uiPriority w:val="9"/>
     <w:qFormat/>
-    <w:rsid w:val="00A10FD9"/>
     <w:pPr>
       <w:keepNext/>
       <w:keepLines/>
-      <w:spacing w:after="80" w:before="360"/>
+      <w:spacing w:after="0" w:before="480"/>
       <w:outlineLvl w:val="0"/>
     </w:pPr>
     <w:rPr>
       <w:rFonts w:asciiTheme="majorHAnsi" w:cstheme="majorBidi" w:eastAsiaTheme="majorEastAsia" w:hAnsiTheme="majorHAnsi"/>
-      <w:color w:themeColor="accent1" w:themeShade="BF" w:val="0F4761"/>
-      <w:sz w:val="40"/>
-      <w:szCs w:val="40"/>
+      <w:b/>
+      <w:bCs/>
+      <w:color w:themeColor="accent1" w:val="4F81BD"/>
+      <w:sz w:val="32"/>
+      <w:szCs w:val="32"/>
     </w:rPr>
   </w:style>
   <w:style w:styleId="Heading2" w:type="paragraph">
-    <w:name w:val="heading 2"/>
+    <w:name w:val="Heading 2"/>
     <w:basedOn w:val="Normal"/>
     <w:next w:val="BodyText"/>
-    <w:link w:val="Heading2Char"/>
     <w:uiPriority w:val="9"/>
-    <w:semiHidden/>
     <w:unhideWhenUsed/>
     <w:qFormat/>
-    <w:rsid w:val="00A10FD9"/>
     <w:pPr>
       <w:keepNext/>
       <w:keepLines/>
-      <w:spacing w:after="80" w:before="160"/>
+      <w:spacing w:after="0" w:before="200"/>
       <w:outlineLvl w:val="1"/>
     </w:pPr>
     <w:rPr>
       <w:rFonts w:asciiTheme="majorHAnsi" w:cstheme="majorBidi" w:eastAsiaTheme="majorEastAsia" w:hAnsiTheme="majorHAnsi"/>
-      <w:color w:themeColor="accent1" w:themeShade="BF" w:val="0F4761"/>
-      <w:sz w:val="32"/>
-      <w:szCs w:val="32"/>
+      <w:b/>
+      <w:bCs/>
+      <w:color w:themeColor="accent1" w:val="4F81BD"/>
+      <w:sz w:val="28"/>
+      <w:szCs w:val="28"/>
     </w:rPr>
   </w:style>
   <w:style w:styleId="Heading3" w:type="paragraph">
-    <w:name w:val="heading 3"/>
+    <w:name w:val="Heading 3"/>
     <w:basedOn w:val="Normal"/>
     <w:next w:val="BodyText"/>
-    <w:link w:val="Heading3Char"/>
     <w:uiPriority w:val="9"/>
-    <w:semiHidden/>
     <w:unhideWhenUsed/>
     <w:qFormat/>
-    <w:rsid w:val="00A10FD9"/>
     <w:pPr>
       <w:keepNext/>
       <w:keepLines/>
-      <w:spacing w:after="80" w:before="160"/>
+      <w:spacing w:after="0" w:before="200"/>
       <w:outlineLvl w:val="2"/>
     </w:pPr>
     <w:rPr>
-      <w:rFonts w:cstheme="majorBidi" w:eastAsiaTheme="majorEastAsia"/>
-      <w:color w:themeColor="accent1" w:themeShade="BF" w:val="0F4761"/>
-      <w:sz w:val="28"/>
-      <w:szCs w:val="28"/>
+      <w:rFonts w:asciiTheme="majorHAnsi" w:cstheme="majorBidi" w:eastAsiaTheme="majorEastAsia" w:hAnsiTheme="majorHAnsi"/>
+      <w:b/>
+      <w:bCs/>
+      <w:color w:themeColor="accent1" w:val="4F81BD"/>
+      <w:sz w:val="24"/>
+      <w:szCs w:val="24"/>
     </w:rPr>
   </w:style>
   <w:style w:styleId="Heading4" w:type="paragraph">
-    <w:name w:val="heading 4"/>
+    <w:name w:val="Heading 4"/>
     <w:basedOn w:val="Normal"/>
     <w:next w:val="BodyText"/>
-    <w:link w:val="Heading4Char"/>
     <w:uiPriority w:val="9"/>
-    <w:semiHidden/>
     <w:unhideWhenUsed/>
     <w:qFormat/>
-    <w:rsid w:val="00A10FD9"/>
     <w:pPr>
       <w:keepNext/>
       <w:keepLines/>
-      <w:spacing w:after="40" w:before="80"/>
+      <w:spacing w:after="0" w:before="200"/>
       <w:outlineLvl w:val="3"/>
     </w:pPr>
     <w:rPr>
-      <w:rFonts w:cstheme="majorBidi" w:eastAsiaTheme="majorEastAsia"/>
+      <w:rFonts w:asciiTheme="majorHAnsi" w:cstheme="majorBidi" w:eastAsiaTheme="majorEastAsia" w:hAnsiTheme="majorHAnsi"/>
       <w:i/>
-      <w:iCs/>
-      <w:color w:themeColor="accent1" w:themeShade="BF" w:val="0F4761"/>
+      <w:bCs/>
+      <w:color w:themeColor="accent1" w:val="4F81BD"/>
+      <w:sz w:val="24"/>
+      <w:szCs w:val="24"/>
     </w:rPr>
   </w:style>
   <w:style w:styleId="Heading5" w:type="paragraph">
-    <w:name w:val="heading 5"/>
+    <w:name w:val="Heading 5"/>
     <w:basedOn w:val="Normal"/>
     <w:next w:val="BodyText"/>
-    <w:link w:val="Heading5Char"/>
     <w:uiPriority w:val="9"/>
-    <w:semiHidden/>
     <w:unhideWhenUsed/>
     <w:qFormat/>
-    <w:rsid w:val="00A10FD9"/>
     <w:pPr>
       <w:keepNext/>
       <w:keepLines/>
-      <w:spacing w:after="40" w:before="80"/>
+      <w:spacing w:after="0" w:before="200"/>
       <w:outlineLvl w:val="4"/>
     </w:pPr>
     <w:rPr>
-      <w:rFonts w:cstheme="majorBidi" w:eastAsiaTheme="majorEastAsia"/>
-      <w:color w:themeColor="accent1" w:themeShade="BF" w:val="0F4761"/>
+      <w:rFonts w:asciiTheme="majorHAnsi" w:cstheme="majorBidi" w:eastAsiaTheme="majorEastAsia" w:hAnsiTheme="majorHAnsi"/>
+      <w:iCs/>
+      <w:color w:themeColor="accent1" w:val="4F81BD"/>
+      <w:sz w:val="24"/>
+      <w:szCs w:val="24"/>
     </w:rPr>
   </w:style>
   <w:style w:styleId="Heading6" w:type="paragraph">
-    <w:name w:val="heading 6"/>
+    <w:name w:val="Heading 6"/>
     <w:basedOn w:val="Normal"/>
     <w:next w:val="BodyText"/>
-    <w:link w:val="Heading6Char"/>
     <w:uiPriority w:val="9"/>
-    <w:semiHidden/>
     <w:unhideWhenUsed/>
     <w:qFormat/>
-    <w:rsid w:val="00A10FD9"/>
     <w:pPr>
       <w:keepNext/>
       <w:keepLines/>
-      <w:spacing w:after="0" w:before="40"/>
+      <w:spacing w:after="0" w:before="200"/>
       <w:outlineLvl w:val="5"/>
     </w:pPr>
     <w:rPr>
-      <w:rFonts w:cstheme="majorBidi" w:eastAsiaTheme="majorEastAsia"/>
-      <w:i/>
-      <w:iCs/>
-      <w:color w:themeColor="text1" w:themeTint="A6" w:val="595959"/>
+      <w:rFonts w:asciiTheme="majorHAnsi" w:cstheme="majorBidi" w:eastAsiaTheme="majorEastAsia" w:hAnsiTheme="majorHAnsi"/>
+      <w:color w:themeColor="accent1" w:val="4F81BD"/>
+      <w:sz w:val="24"/>
+      <w:szCs w:val="24"/>
     </w:rPr>
   </w:style>
   <w:style w:styleId="Heading7" w:type="paragraph">
-    <w:name w:val="heading 7"/>
+    <w:name w:val="Heading 7"/>
     <w:basedOn w:val="Normal"/>
     <w:next w:val="BodyText"/>
-    <w:link w:val="Heading7Char"/>
     <w:uiPriority w:val="9"/>
-    <w:semiHidden/>
     <w:unhideWhenUsed/>
     <w:qFormat/>
-    <w:rsid w:val="00A10FD9"/>
     <w:pPr>
       <w:keepNext/>
       <w:keepLines/>
-      <w:spacing w:after="0" w:before="40"/>
+      <w:spacing w:after="0" w:before="200"/>
       <w:outlineLvl w:val="6"/>
     </w:pPr>
     <w:rPr>
-      <w:rFonts w:cstheme="majorBidi" w:eastAsiaTheme="majorEastAsia"/>
-      <w:color w:themeColor="text1" w:themeTint="A6" w:val="595959"/>
+      <w:rFonts w:asciiTheme="majorHAnsi" w:cstheme="majorBidi" w:eastAsiaTheme="majorEastAsia" w:hAnsiTheme="majorHAnsi"/>
+      <w:color w:themeColor="accent1" w:val="4F81BD"/>
+      <w:sz w:val="24"/>
+      <w:szCs w:val="24"/>
     </w:rPr>
   </w:style>
   <w:style w:styleId="Heading8" w:type="paragraph">
-    <w:name w:val="heading 8"/>
+    <w:name w:val="Heading 8"/>
     <w:basedOn w:val="Normal"/>
     <w:next w:val="BodyText"/>
-    <w:link w:val="Heading8Char"/>
     <w:uiPriority w:val="9"/>
-    <w:semiHidden/>
     <w:unhideWhenUsed/>
     <w:qFormat/>
-    <w:rsid w:val="00A10FD9"/>
     <w:pPr>
       <w:keepNext/>
       <w:keepLines/>
-      <w:spacing w:after="0"/>
+      <w:spacing w:after="0" w:before="200"/>
       <w:outlineLvl w:val="7"/>
     </w:pPr>
     <w:rPr>
-      <w:rFonts w:cstheme="majorBidi" w:eastAsiaTheme="majorEastAsia"/>
-      <w:i/>
-      <w:iCs/>
-      <w:color w:themeColor="text1" w:themeTint="D8" w:val="272727"/>
+      <w:rFonts w:asciiTheme="majorHAnsi" w:cstheme="majorBidi" w:eastAsiaTheme="majorEastAsia" w:hAnsiTheme="majorHAnsi"/>
+      <w:color w:themeColor="accent1" w:val="4F81BD"/>
+      <w:sz w:val="24"/>
+      <w:szCs w:val="24"/>
     </w:rPr>
   </w:style>
   <w:style w:styleId="Heading9" w:type="paragraph">
-    <w:name w:val="heading 9"/>
+    <w:name w:val="Heading 9"/>
     <w:basedOn w:val="Normal"/>
     <w:next w:val="BodyText"/>
-    <w:link w:val="Heading9Char"/>
     <w:uiPriority w:val="9"/>
-    <w:semiHidden/>
     <w:unhideWhenUsed/>
     <w:qFormat/>
-    <w:rsid w:val="00A10FD9"/>
     <w:pPr>
       <w:keepNext/>
       <w:keepLines/>
-      <w:spacing w:after="0"/>
+      <w:spacing w:after="0" w:before="200"/>
       <w:outlineLvl w:val="8"/>
     </w:pPr>
     <w:rPr>
-      <w:rFonts w:cstheme="majorBidi" w:eastAsiaTheme="majorEastAsia"/>
-      <w:color w:themeColor="text1" w:themeTint="D8" w:val="272727"/>
-    </w:rPr>
-  </w:style>
-  <w:style w:customStyle="1" w:styleId="Heading1Char" w:type="character">
-    <w:name w:val="Heading 1 Char"/>
-    <w:basedOn w:val="DefaultParagraphFont"/>
-    <w:link w:val="Heading1"/>
-    <w:uiPriority w:val="9"/>
-    <w:rsid w:val="00A10FD9"/>
-    <w:rPr>
       <w:rFonts w:asciiTheme="majorHAnsi" w:cstheme="majorBidi" w:eastAsiaTheme="majorEastAsia" w:hAnsiTheme="majorHAnsi"/>
-      <w:color w:themeColor="accent1" w:themeShade="BF" w:val="0F4761"/>
-      <w:sz w:val="40"/>
-      <w:szCs w:val="40"/>
-    </w:rPr>
-  </w:style>
-  <w:style w:customStyle="1" w:styleId="Heading2Char" w:type="character">
-    <w:name w:val="Heading 2 Char"/>
-    <w:basedOn w:val="DefaultParagraphFont"/>
-    <w:link w:val="Heading2"/>
-    <w:uiPriority w:val="9"/>
-    <w:semiHidden/>
-    <w:rsid w:val="00A10FD9"/>
-    <w:rPr>
-      <w:rFonts w:asciiTheme="majorHAnsi" w:cstheme="majorBidi" w:eastAsiaTheme="majorEastAsia" w:hAnsiTheme="majorHAnsi"/>
-      <w:color w:themeColor="accent1" w:themeShade="BF" w:val="0F4761"/>
-      <w:sz w:val="32"/>
-      <w:szCs w:val="32"/>
-    </w:rPr>
-  </w:style>
-  <w:style w:customStyle="1" w:styleId="Heading3Char" w:type="character">
-    <w:name w:val="Heading 3 Char"/>
-    <w:basedOn w:val="DefaultParagraphFont"/>
-    <w:link w:val="Heading3"/>
-    <w:uiPriority w:val="9"/>
-    <w:semiHidden/>
-    <w:rsid w:val="00A10FD9"/>
-    <w:rPr>
-      <w:rFonts w:cstheme="majorBidi" w:eastAsiaTheme="majorEastAsia"/>
-      <w:color w:themeColor="accent1" w:themeShade="BF" w:val="0F4761"/>
-      <w:sz w:val="28"/>
-      <w:szCs w:val="28"/>
-    </w:rPr>
-  </w:style>
-  <w:style w:customStyle="1" w:styleId="Heading4Char" w:type="character">
-    <w:name w:val="Heading 4 Char"/>
-    <w:basedOn w:val="DefaultParagraphFont"/>
-    <w:link w:val="Heading4"/>
-    <w:uiPriority w:val="9"/>
-    <w:semiHidden/>
-    <w:rsid w:val="00A10FD9"/>
-    <w:rPr>
-      <w:rFonts w:cstheme="majorBidi" w:eastAsiaTheme="majorEastAsia"/>
-      <w:i/>
-      <w:iCs/>
-      <w:color w:themeColor="accent1" w:themeShade="BF" w:val="0F4761"/>
-    </w:rPr>
-  </w:style>
-  <w:style w:customStyle="1" w:styleId="Heading5Char" w:type="character">
-    <w:name w:val="Heading 5 Char"/>
-    <w:basedOn w:val="DefaultParagraphFont"/>
-    <w:link w:val="Heading5"/>
-    <w:uiPriority w:val="9"/>
-    <w:semiHidden/>
-    <w:rsid w:val="00A10FD9"/>
-    <w:rPr>
-      <w:rFonts w:cstheme="majorBidi" w:eastAsiaTheme="majorEastAsia"/>
-      <w:color w:themeColor="accent1" w:themeShade="BF" w:val="0F4761"/>
-    </w:rPr>
-  </w:style>
-  <w:style w:customStyle="1" w:styleId="Heading6Char" w:type="character">
-    <w:name w:val="Heading 6 Char"/>
-    <w:basedOn w:val="DefaultParagraphFont"/>
-    <w:link w:val="Heading6"/>
-    <w:uiPriority w:val="9"/>
-    <w:semiHidden/>
-    <w:rsid w:val="00A10FD9"/>
-    <w:rPr>
-      <w:rFonts w:cstheme="majorBidi" w:eastAsiaTheme="majorEastAsia"/>
-      <w:i/>
-      <w:iCs/>
-      <w:color w:themeColor="text1" w:themeTint="A6" w:val="595959"/>
-    </w:rPr>
-  </w:style>
-  <w:style w:customStyle="1" w:styleId="Heading7Char" w:type="character">
-    <w:name w:val="Heading 7 Char"/>
-    <w:basedOn w:val="DefaultParagraphFont"/>
-    <w:link w:val="Heading7"/>
-    <w:uiPriority w:val="9"/>
-    <w:semiHidden/>
-    <w:rsid w:val="00A10FD9"/>
-    <w:rPr>
-      <w:rFonts w:cstheme="majorBidi" w:eastAsiaTheme="majorEastAsia"/>
-      <w:color w:themeColor="text1" w:themeTint="A6" w:val="595959"/>
-    </w:rPr>
-  </w:style>
-  <w:style w:customStyle="1" w:styleId="Heading8Char" w:type="character">
-    <w:name w:val="Heading 8 Char"/>
-    <w:basedOn w:val="DefaultParagraphFont"/>
-    <w:link w:val="Heading8"/>
-    <w:uiPriority w:val="9"/>
-    <w:semiHidden/>
-    <w:rsid w:val="00A10FD9"/>
-    <w:rPr>
-      <w:rFonts w:cstheme="majorBidi" w:eastAsiaTheme="majorEastAsia"/>
-      <w:i/>
-      <w:iCs/>
-      <w:color w:themeColor="text1" w:themeTint="D8" w:val="272727"/>
-    </w:rPr>
-  </w:style>
-  <w:style w:customStyle="1" w:styleId="Heading9Char" w:type="character">
-    <w:name w:val="Heading 9 Char"/>
-    <w:basedOn w:val="DefaultParagraphFont"/>
-    <w:link w:val="Heading9"/>
-    <w:uiPriority w:val="9"/>
-    <w:semiHidden/>
-    <w:rsid w:val="00A10FD9"/>
-    <w:rPr>
-      <w:rFonts w:cstheme="majorBidi" w:eastAsiaTheme="majorEastAsia"/>
-      <w:color w:themeColor="text1" w:themeTint="D8" w:val="272727"/>
+      <w:color w:themeColor="accent1" w:val="4F81BD"/>
+      <w:sz w:val="24"/>
+      <w:szCs w:val="24"/>
     </w:rPr>
   </w:style>
   <w:style w:styleId="BlockText" w:type="paragraph">
@@ -3418,18 +3274,6 @@
     <w:uiPriority w:val="9"/>
     <w:unhideWhenUsed/>
     <w:qFormat/>
-  </w:style>
-  <w:style w:styleId="FootnoteBlockText" w:type="paragraph">
-    <w:name w:val="Footnote Block Text"/>
-    <w:basedOn w:val="FootnoteText"/>
-    <w:next w:val="FootnoteText"/>
-    <w:uiPriority w:val="9"/>
-    <w:unhideWhenUsed/>
-    <w:qFormat/>
-    <w:pPr>
-      <w:spacing w:after="100" w:before="100"/>
-      <w:ind w:firstLine="0" w:left="480" w:right="480"/>
-    </w:pPr>
   </w:style>
   <w:style w:default="1" w:styleId="DefaultParagraphFont" w:type="character">
     <w:name w:val="Default Paragraph Font"/>
@@ -3452,11 +3296,18 @@
       </w:tblCellMar>
     </w:tblPr>
     <w:tblStylePr w:type="firstRow">
+      <w:tblPr>
+        <w:jc w:val="left"/>
+        <w:tblInd w:type="dxa" w:w="0"/>
+      </w:tblPr>
+      <w:trPr>
+        <w:jc w:val="left"/>
+      </w:trPr>
       <w:tcPr>
+        <w:vAlign w:val="bottom"/>
         <w:tcBorders>
           <w:bottom w:val="single"/>
         </w:tcBorders>
-        <w:vAlign w:val="bottom"/>
       </w:tcPr>
     </w:tblStylePr>
   </w:style>
@@ -3571,8 +3422,8 @@
     <w:name w:val="KeywordTok"/>
     <w:basedOn w:val="VerbatimChar"/>
     <w:rPr>
+      <w:color w:val="007020"/>
       <w:b/>
-      <w:color w:val="007020"/>
     </w:rPr>
   </w:style>
   <w:style w:type="character" w:customStyle="1" w:styleId="DataTypeTok">
@@ -3649,42 +3500,42 @@
     <w:name w:val="ImportTok"/>
     <w:basedOn w:val="VerbatimChar"/>
     <w:rPr>
+      <w:color w:val="008000"/>
       <w:b/>
-      <w:color w:val="008000"/>
     </w:rPr>
   </w:style>
   <w:style w:type="character" w:customStyle="1" w:styleId="CommentTok">
     <w:name w:val="CommentTok"/>
     <w:basedOn w:val="VerbatimChar"/>
     <w:rPr>
+      <w:color w:val="60a0b0"/>
       <w:i/>
-      <w:color w:val="60a0b0"/>
     </w:rPr>
   </w:style>
   <w:style w:type="character" w:customStyle="1" w:styleId="DocumentationTok">
     <w:name w:val="DocumentationTok"/>
     <w:basedOn w:val="VerbatimChar"/>
     <w:rPr>
+      <w:color w:val="ba2121"/>
       <w:i/>
-      <w:color w:val="ba2121"/>
     </w:rPr>
   </w:style>
   <w:style w:type="character" w:customStyle="1" w:styleId="AnnotationTok">
     <w:name w:val="AnnotationTok"/>
     <w:basedOn w:val="VerbatimChar"/>
     <w:rPr>
+      <w:color w:val="60a0b0"/>
       <w:b/>
       <w:i/>
-      <w:color w:val="60a0b0"/>
     </w:rPr>
   </w:style>
   <w:style w:type="character" w:customStyle="1" w:styleId="CommentVarTok">
     <w:name w:val="CommentVarTok"/>
     <w:basedOn w:val="VerbatimChar"/>
     <w:rPr>
+      <w:color w:val="60a0b0"/>
       <w:b/>
       <w:i/>
-      <w:color w:val="60a0b0"/>
     </w:rPr>
   </w:style>
   <w:style w:type="character" w:customStyle="1" w:styleId="OtherTok">
@@ -3712,8 +3563,8 @@
     <w:name w:val="ControlFlowTok"/>
     <w:basedOn w:val="VerbatimChar"/>
     <w:rPr>
+      <w:color w:val="007020"/>
       <w:b/>
-      <w:color w:val="007020"/>
     </w:rPr>
   </w:style>
   <w:style w:type="character" w:customStyle="1" w:styleId="OperatorTok">
@@ -3758,34 +3609,34 @@
     <w:name w:val="InformationTok"/>
     <w:basedOn w:val="VerbatimChar"/>
     <w:rPr>
+      <w:color w:val="60a0b0"/>
       <w:b/>
       <w:i/>
-      <w:color w:val="60a0b0"/>
     </w:rPr>
   </w:style>
   <w:style w:type="character" w:customStyle="1" w:styleId="WarningTok">
     <w:name w:val="WarningTok"/>
     <w:basedOn w:val="VerbatimChar"/>
     <w:rPr>
+      <w:color w:val="60a0b0"/>
       <w:b/>
       <w:i/>
-      <w:color w:val="60a0b0"/>
     </w:rPr>
   </w:style>
   <w:style w:type="character" w:customStyle="1" w:styleId="AlertTok">
     <w:name w:val="AlertTok"/>
     <w:basedOn w:val="VerbatimChar"/>
     <w:rPr>
+      <w:color w:val="ff0000"/>
       <w:b/>
-      <w:color w:val="ff0000"/>
     </w:rPr>
   </w:style>
   <w:style w:type="character" w:customStyle="1" w:styleId="ErrorTok">
     <w:name w:val="ErrorTok"/>
     <w:basedOn w:val="VerbatimChar"/>
     <w:rPr>
+      <w:color w:val="ff0000"/>
       <w:b/>
-      <w:color w:val="ff0000"/>
     </w:rPr>
   </w:style>
   <w:style w:type="character" w:customStyle="1" w:styleId="NormalTok">
@@ -3807,44 +3658,44 @@
         <a:sysClr val="window" lastClr="FFFFFF"/>
       </a:lt1>
       <a:dk2>
-        <a:srgbClr val="0E2841"/>
+        <a:srgbClr val="1F497D"/>
       </a:dk2>
       <a:lt2>
-        <a:srgbClr val="E8E8E8"/>
+        <a:srgbClr val="EEECE1"/>
       </a:lt2>
       <a:accent1>
-        <a:srgbClr val="156082"/>
+        <a:srgbClr val="4F81BD"/>
       </a:accent1>
       <a:accent2>
-        <a:srgbClr val="E97132"/>
+        <a:srgbClr val="C0504D"/>
       </a:accent2>
       <a:accent3>
-        <a:srgbClr val="196B24"/>
+        <a:srgbClr val="9BBB59"/>
       </a:accent3>
       <a:accent4>
-        <a:srgbClr val="0F9ED5"/>
+        <a:srgbClr val="8064A2"/>
       </a:accent4>
       <a:accent5>
-        <a:srgbClr val="A02B93"/>
+        <a:srgbClr val="4BACC6"/>
       </a:accent5>
       <a:accent6>
-        <a:srgbClr val="4EA72E"/>
+        <a:srgbClr val="F79646"/>
       </a:accent6>
       <a:hlink>
-        <a:srgbClr val="467886"/>
+        <a:srgbClr val="0000FF"/>
       </a:hlink>
       <a:folHlink>
-        <a:srgbClr val="96607D"/>
+        <a:srgbClr val="800080"/>
       </a:folHlink>
     </a:clrScheme>
     <a:fontScheme name="Office">
       <a:majorFont>
-        <a:latin typeface="Aptos Display" panose="02110004020202020204"/>
+        <a:latin typeface="Calibri"/>
         <a:ea typeface=""/>
         <a:cs typeface=""/>
-        <a:font script="Jpan" typeface="游ゴシック Light"/>
+        <a:font script="Jpan" typeface="ＭＳ ゴシック"/>
         <a:font script="Hang" typeface="맑은 고딕"/>
-        <a:font script="Hans" typeface="等线 Light"/>
+        <a:font script="Hans" typeface="宋体"/>
         <a:font script="Hant" typeface="新細明體"/>
         <a:font script="Arab" typeface="Times New Roman"/>
         <a:font script="Hebr" typeface="Times New Roman"/>
@@ -3871,32 +3722,14 @@
         <a:font script="Mong" typeface="Mongolian Baiti"/>
         <a:font script="Viet" typeface="Times New Roman"/>
         <a:font script="Uigh" typeface="Microsoft Uighur"/>
-        <a:font script="Geor" typeface="Sylfaen"/>
-        <a:font script="Armn" typeface="Arial"/>
-        <a:font script="Bugi" typeface="Leelawadee UI"/>
-        <a:font script="Bopo" typeface="Microsoft JhengHei"/>
-        <a:font script="Java" typeface="Javanese Text"/>
-        <a:font script="Lisu" typeface="Segoe UI"/>
-        <a:font script="Mymr" typeface="Myanmar Text"/>
-        <a:font script="Nkoo" typeface="Ebrima"/>
-        <a:font script="Olck" typeface="Nirmala UI"/>
-        <a:font script="Osma" typeface="Ebrima"/>
-        <a:font script="Phag" typeface="Phagspa"/>
-        <a:font script="Syrn" typeface="Estrangelo Edessa"/>
-        <a:font script="Syrj" typeface="Estrangelo Edessa"/>
-        <a:font script="Syre" typeface="Estrangelo Edessa"/>
-        <a:font script="Sora" typeface="Nirmala UI"/>
-        <a:font script="Tale" typeface="Microsoft Tai Le"/>
-        <a:font script="Talu" typeface="Microsoft New Tai Lue"/>
-        <a:font script="Tfng" typeface="Ebrima"/>
       </a:majorFont>
       <a:minorFont>
-        <a:latin typeface="Aptos" panose="02110004020202020204"/>
+        <a:latin typeface="Cambria"/>
         <a:ea typeface=""/>
         <a:cs typeface=""/>
-        <a:font script="Jpan" typeface="游明朝"/>
+        <a:font script="Jpan" typeface="ＭＳ 明朝"/>
         <a:font script="Hang" typeface="맑은 고딕"/>
-        <a:font script="Hans" typeface="等线"/>
+        <a:font script="Hans" typeface="宋体"/>
         <a:font script="Hant" typeface="新細明體"/>
         <a:font script="Arab" typeface="Arial"/>
         <a:font script="Hebr" typeface="Arial"/>
@@ -3923,24 +3756,6 @@
         <a:font script="Mong" typeface="Mongolian Baiti"/>
         <a:font script="Viet" typeface="Arial"/>
         <a:font script="Uigh" typeface="Microsoft Uighur"/>
-        <a:font script="Geor" typeface="Sylfaen"/>
-        <a:font script="Armn" typeface="Arial"/>
-        <a:font script="Bugi" typeface="Leelawadee UI"/>
-        <a:font script="Bopo" typeface="Microsoft JhengHei"/>
-        <a:font script="Java" typeface="Javanese Text"/>
-        <a:font script="Lisu" typeface="Segoe UI"/>
-        <a:font script="Mymr" typeface="Myanmar Text"/>
-        <a:font script="Nkoo" typeface="Ebrima"/>
-        <a:font script="Olck" typeface="Nirmala UI"/>
-        <a:font script="Osma" typeface="Ebrima"/>
-        <a:font script="Phag" typeface="Phagspa"/>
-        <a:font script="Syrn" typeface="Estrangelo Edessa"/>
-        <a:font script="Syrj" typeface="Estrangelo Edessa"/>
-        <a:font script="Syre" typeface="Estrangelo Edessa"/>
-        <a:font script="Sora" typeface="Nirmala UI"/>
-        <a:font script="Tale" typeface="Microsoft Tai Le"/>
-        <a:font script="Talu" typeface="Microsoft New Tai Lue"/>
-        <a:font script="Tfng" typeface="Ebrima"/>
       </a:minorFont>
     </a:fontScheme>
     <a:fmtScheme name="Office">
@@ -3952,141 +3767,200 @@
           <a:gsLst>
             <a:gs pos="0">
               <a:schemeClr val="phClr">
-                <a:lumMod val="110000"/>
-                <a:satMod val="105000"/>
-                <a:tint val="67000"/>
+                <a:tint val="50000"/>
+                <a:satMod val="300000"/>
               </a:schemeClr>
             </a:gs>
-            <a:gs pos="50000">
+            <a:gs pos="35000">
               <a:schemeClr val="phClr">
-                <a:lumMod val="105000"/>
-                <a:satMod val="103000"/>
-                <a:tint val="73000"/>
+                <a:tint val="37000"/>
+                <a:satMod val="300000"/>
               </a:schemeClr>
             </a:gs>
             <a:gs pos="100000">
               <a:schemeClr val="phClr">
-                <a:lumMod val="105000"/>
-                <a:satMod val="109000"/>
-                <a:tint val="81000"/>
+                <a:tint val="15000"/>
+                <a:satMod val="350000"/>
               </a:schemeClr>
             </a:gs>
           </a:gsLst>
-          <a:lin ang="5400000" scaled="0"/>
+          <a:lin ang="16200000" scaled="1"/>
         </a:gradFill>
         <a:gradFill rotWithShape="1">
           <a:gsLst>
             <a:gs pos="0">
               <a:schemeClr val="phClr">
-                <a:satMod val="103000"/>
-                <a:lumMod val="102000"/>
-                <a:tint val="94000"/>
-              </a:schemeClr>
-            </a:gs>
-            <a:gs pos="50000">
-              <a:schemeClr val="phClr">
-                <a:satMod val="110000"/>
-                <a:lumMod val="100000"/>
+                <a:tint val="100000"/>
                 <a:shade val="100000"/>
+                <a:satMod val="130000"/>
               </a:schemeClr>
             </a:gs>
             <a:gs pos="100000">
               <a:schemeClr val="phClr">
-                <a:lumMod val="99000"/>
-                <a:satMod val="120000"/>
-                <a:shade val="78000"/>
+                <a:tint val="50000"/>
+                <a:shade val="100000"/>
+                <a:satMod val="350000"/>
               </a:schemeClr>
             </a:gs>
           </a:gsLst>
-          <a:lin ang="5400000" scaled="0"/>
+          <a:lin ang="16200000" scaled="0"/>
         </a:gradFill>
       </a:fillStyleLst>
       <a:lnStyleLst>
-        <a:ln w="6350" cap="flat" cmpd="sng" algn="ctr">
+        <a:ln w="9525" cap="flat" cmpd="sng" algn="ctr">
+          <a:solidFill>
+            <a:schemeClr val="phClr">
+              <a:shade val="95000"/>
+              <a:satMod val="105000"/>
+            </a:schemeClr>
+          </a:solidFill>
+          <a:prstDash val="solid"/>
+        </a:ln>
+        <a:ln w="25400" cap="flat" cmpd="sng" algn="ctr">
           <a:solidFill>
             <a:schemeClr val="phClr"/>
           </a:solidFill>
           <a:prstDash val="solid"/>
-          <a:miter lim="800000"/>
         </a:ln>
-        <a:ln w="12700" cap="flat" cmpd="sng" algn="ctr">
+        <a:ln w="38100" cap="flat" cmpd="sng" algn="ctr">
           <a:solidFill>
             <a:schemeClr val="phClr"/>
           </a:solidFill>
           <a:prstDash val="solid"/>
-          <a:miter lim="800000"/>
-        </a:ln>
-        <a:ln w="19050" cap="flat" cmpd="sng" algn="ctr">
-          <a:solidFill>
-            <a:schemeClr val="phClr"/>
-          </a:solidFill>
-          <a:prstDash val="solid"/>
-          <a:miter lim="800000"/>
         </a:ln>
       </a:lnStyleLst>
       <a:effectStyleLst>
         <a:effectStyle>
-          <a:effectLst/>
-        </a:effectStyle>
-        <a:effectStyle>
-          <a:effectLst/>
+          <a:effectLst>
+            <a:outerShdw blurRad="40000" dist="20000" dir="5400000" rotWithShape="0">
+              <a:srgbClr val="000000">
+                <a:alpha val="38000"/>
+              </a:srgbClr>
+            </a:outerShdw>
+          </a:effectLst>
         </a:effectStyle>
         <a:effectStyle>
           <a:effectLst>
-            <a:outerShdw blurRad="57150" dist="19050" dir="5400000" algn="ctr" rotWithShape="0">
+            <a:outerShdw blurRad="40000" dist="23000" dir="5400000" rotWithShape="0">
               <a:srgbClr val="000000">
-                <a:alpha val="63000"/>
+                <a:alpha val="35000"/>
               </a:srgbClr>
             </a:outerShdw>
           </a:effectLst>
+        </a:effectStyle>
+        <a:effectStyle>
+          <a:effectLst>
+            <a:outerShdw blurRad="40000" dist="23000" dir="5400000" rotWithShape="0">
+              <a:srgbClr val="000000">
+                <a:alpha val="35000"/>
+              </a:srgbClr>
+            </a:outerShdw>
+          </a:effectLst>
+          <a:scene3d>
+            <a:camera prst="orthographicFront">
+              <a:rot lat="0" lon="0" rev="0"/>
+            </a:camera>
+            <a:lightRig rig="threePt" dir="t">
+              <a:rot lat="0" lon="0" rev="1200000"/>
+            </a:lightRig>
+          </a:scene3d>
+          <a:sp3d>
+            <a:bevelT w="63500" h="25400"/>
+          </a:sp3d>
         </a:effectStyle>
       </a:effectStyleLst>
       <a:bgFillStyleLst>
         <a:solidFill>
           <a:schemeClr val="phClr"/>
         </a:solidFill>
-        <a:solidFill>
-          <a:schemeClr val="phClr">
-            <a:tint val="95000"/>
-            <a:satMod val="170000"/>
-          </a:schemeClr>
-        </a:solidFill>
         <a:gradFill rotWithShape="1">
           <a:gsLst>
             <a:gs pos="0">
               <a:schemeClr val="phClr">
-                <a:tint val="93000"/>
-                <a:satMod val="150000"/>
-                <a:shade val="98000"/>
-                <a:lumMod val="102000"/>
+                <a:tint val="40000"/>
+                <a:satMod val="350000"/>
               </a:schemeClr>
             </a:gs>
-            <a:gs pos="50000">
+            <a:gs pos="40000">
               <a:schemeClr val="phClr">
-                <a:tint val="98000"/>
-                <a:satMod val="130000"/>
-                <a:shade val="90000"/>
-                <a:lumMod val="103000"/>
+                <a:tint val="45000"/>
+                <a:shade val="99000"/>
+                <a:satMod val="350000"/>
               </a:schemeClr>
             </a:gs>
             <a:gs pos="100000">
               <a:schemeClr val="phClr">
-                <a:shade val="63000"/>
-                <a:satMod val="120000"/>
+                <a:shade val="20000"/>
+                <a:satMod val="255000"/>
               </a:schemeClr>
             </a:gs>
           </a:gsLst>
-          <a:lin ang="5400000" scaled="0"/>
+          <a:path path="circle">
+            <a:fillToRect l="50000" t="-80000" r="50000" b="180000"/>
+          </a:path>
+        </a:gradFill>
+        <a:gradFill rotWithShape="1">
+          <a:gsLst>
+            <a:gs pos="0">
+              <a:schemeClr val="phClr">
+                <a:tint val="80000"/>
+                <a:satMod val="300000"/>
+              </a:schemeClr>
+            </a:gs>
+            <a:gs pos="100000">
+              <a:schemeClr val="phClr">
+                <a:shade val="30000"/>
+                <a:satMod val="200000"/>
+              </a:schemeClr>
+            </a:gs>
+          </a:gsLst>
+          <a:path path="circle">
+            <a:fillToRect l="50000" t="50000" r="50000" b="50000"/>
+          </a:path>
         </a:gradFill>
       </a:bgFillStyleLst>
     </a:fmtScheme>
   </a:themeElements>
-  <a:objectDefaults/>
+  <a:objectDefaults>
+    <a:spDef>
+      <a:spPr/>
+      <a:bodyPr/>
+      <a:lstStyle/>
+      <a:style>
+        <a:lnRef idx="1">
+          <a:schemeClr val="accent1"/>
+        </a:lnRef>
+        <a:fillRef idx="3">
+          <a:schemeClr val="accent1"/>
+        </a:fillRef>
+        <a:effectRef idx="2">
+          <a:schemeClr val="accent1"/>
+        </a:effectRef>
+        <a:fontRef idx="minor">
+          <a:schemeClr val="lt1"/>
+        </a:fontRef>
+      </a:style>
+    </a:spDef>
+    <a:lnDef>
+      <a:spPr/>
+      <a:bodyPr/>
+      <a:lstStyle/>
+      <a:style>
+        <a:lnRef idx="2">
+          <a:schemeClr val="accent1"/>
+        </a:lnRef>
+        <a:fillRef idx="0">
+          <a:schemeClr val="accent1"/>
+        </a:fillRef>
+        <a:effectRef idx="1">
+          <a:schemeClr val="accent1"/>
+        </a:effectRef>
+        <a:fontRef idx="minor">
+          <a:schemeClr val="tx1"/>
+        </a:fontRef>
+      </a:style>
+    </a:lnDef>
+  </a:objectDefaults>
   <a:extraClrSchemeLst/>
-  <a:extLst>
-    <a:ext uri="{05A4C25C-085E-4340-85A3-A5531E510DB2}">
-      <thm15:themeFamily xmlns:thm15="http://schemas.microsoft.com/office/thememl/2012/main" name="Office Theme" id="{2E142A2C-CD16-42D6-873A-C26D2A0506FA}" vid="{1BDDFF52-6CD6-40A5-AB3C-68EB2F1E4D0A}"/>
-    </a:ext>
-  </a:extLst>
 </a:theme>
 </file>
</xml_diff>